<commit_message>
Added the first draft of Goals Tracker in User-manual(2).docx
</commit_message>
<xml_diff>
--- a/User manual/User-manual(2).docx
+++ b/User manual/User-manual(2).docx
@@ -630,7 +630,7 @@
             </w:rPr>
             <w:fldChar w:fldCharType="separate"/>
           </w:r>
-          <w:hyperlink w:anchor="_Toc193304208" w:history="1">
+          <w:hyperlink w:anchor="_Toc193318595" w:history="1">
             <w:r>
               <w:rPr>
                 <w:rStyle w:val="Hyperlink"/>
@@ -658,7 +658,7 @@
                 <w:noProof/>
                 <w:webHidden/>
               </w:rPr>
-              <w:instrText xml:space="preserve"> PAGEREF _Toc193304208 \h </w:instrText>
+              <w:instrText xml:space="preserve"> PAGEREF _Toc193318595 \h </w:instrText>
             </w:r>
             <w:r>
               <w:rPr>
@@ -703,7 +703,7 @@
               <w:lang w:eastAsia="en-GB"/>
             </w:rPr>
           </w:pPr>
-          <w:hyperlink w:anchor="_Toc193304209" w:history="1">
+          <w:hyperlink w:anchor="_Toc193318596" w:history="1">
             <w:r>
               <w:rPr>
                 <w:rStyle w:val="Hyperlink"/>
@@ -731,7 +731,7 @@
                 <w:noProof/>
                 <w:webHidden/>
               </w:rPr>
-              <w:instrText xml:space="preserve"> PAGEREF _Toc193304209 \h </w:instrText>
+              <w:instrText xml:space="preserve"> PAGEREF _Toc193318596 \h </w:instrText>
             </w:r>
             <w:r>
               <w:rPr>
@@ -776,7 +776,7 @@
               <w:lang w:eastAsia="en-GB"/>
             </w:rPr>
           </w:pPr>
-          <w:hyperlink w:anchor="_Toc193304210" w:history="1">
+          <w:hyperlink w:anchor="_Toc193318597" w:history="1">
             <w:r>
               <w:rPr>
                 <w:rStyle w:val="Hyperlink"/>
@@ -804,7 +804,7 @@
                 <w:noProof/>
                 <w:webHidden/>
               </w:rPr>
-              <w:instrText xml:space="preserve"> PAGEREF _Toc193304210 \h </w:instrText>
+              <w:instrText xml:space="preserve"> PAGEREF _Toc193318597 \h </w:instrText>
             </w:r>
             <w:r>
               <w:rPr>
@@ -849,7 +849,7 @@
               <w:lang w:eastAsia="en-GB"/>
             </w:rPr>
           </w:pPr>
-          <w:hyperlink w:anchor="_Toc193304211" w:history="1">
+          <w:hyperlink w:anchor="_Toc193318598" w:history="1">
             <w:r>
               <w:rPr>
                 <w:rStyle w:val="Hyperlink"/>
@@ -877,7 +877,7 @@
                 <w:noProof/>
                 <w:webHidden/>
               </w:rPr>
-              <w:instrText xml:space="preserve"> PAGEREF _Toc193304211 \h </w:instrText>
+              <w:instrText xml:space="preserve"> PAGEREF _Toc193318598 \h </w:instrText>
             </w:r>
             <w:r>
               <w:rPr>
@@ -922,7 +922,7 @@
               <w:lang w:eastAsia="en-GB"/>
             </w:rPr>
           </w:pPr>
-          <w:hyperlink w:anchor="_Toc193304212" w:history="1">
+          <w:hyperlink w:anchor="_Toc193318599" w:history="1">
             <w:r>
               <w:rPr>
                 <w:rStyle w:val="Hyperlink"/>
@@ -950,7 +950,7 @@
                 <w:noProof/>
                 <w:webHidden/>
               </w:rPr>
-              <w:instrText xml:space="preserve"> PAGEREF _Toc193304212 \h </w:instrText>
+              <w:instrText xml:space="preserve"> PAGEREF _Toc193318599 \h </w:instrText>
             </w:r>
             <w:r>
               <w:rPr>
@@ -995,7 +995,7 @@
               <w:lang w:eastAsia="en-GB"/>
             </w:rPr>
           </w:pPr>
-          <w:hyperlink w:anchor="_Toc193304213" w:history="1">
+          <w:hyperlink w:anchor="_Toc193318600" w:history="1">
             <w:r>
               <w:rPr>
                 <w:rStyle w:val="Hyperlink"/>
@@ -1023,7 +1023,7 @@
                 <w:noProof/>
                 <w:webHidden/>
               </w:rPr>
-              <w:instrText xml:space="preserve"> PAGEREF _Toc193304213 \h </w:instrText>
+              <w:instrText xml:space="preserve"> PAGEREF _Toc193318600 \h </w:instrText>
             </w:r>
             <w:r>
               <w:rPr>
@@ -1068,7 +1068,7 @@
               <w:lang w:eastAsia="en-GB"/>
             </w:rPr>
           </w:pPr>
-          <w:hyperlink w:anchor="_Toc193304214" w:history="1">
+          <w:hyperlink w:anchor="_Toc193318601" w:history="1">
             <w:r>
               <w:rPr>
                 <w:rStyle w:val="Hyperlink"/>
@@ -1096,7 +1096,7 @@
                 <w:noProof/>
                 <w:webHidden/>
               </w:rPr>
-              <w:instrText xml:space="preserve"> PAGEREF _Toc193304214 \h </w:instrText>
+              <w:instrText xml:space="preserve"> PAGEREF _Toc193318601 \h </w:instrText>
             </w:r>
             <w:r>
               <w:rPr>
@@ -1141,7 +1141,7 @@
               <w:lang w:eastAsia="en-GB"/>
             </w:rPr>
           </w:pPr>
-          <w:hyperlink w:anchor="_Toc193304215" w:history="1">
+          <w:hyperlink w:anchor="_Toc193318602" w:history="1">
             <w:r>
               <w:rPr>
                 <w:rStyle w:val="Hyperlink"/>
@@ -1168,7 +1168,7 @@
                 <w:noProof/>
                 <w:webHidden/>
               </w:rPr>
-              <w:instrText xml:space="preserve"> PAGEREF _Toc193304215 \h </w:instrText>
+              <w:instrText xml:space="preserve"> PAGEREF _Toc193318602 \h </w:instrText>
             </w:r>
             <w:r>
               <w:rPr>
@@ -1213,30 +1213,14 @@
               <w:lang w:eastAsia="en-GB"/>
             </w:rPr>
           </w:pPr>
-          <w:hyperlink w:anchor="_Toc193304216" w:history="1">
+          <w:hyperlink w:anchor="_Toc193318603" w:history="1">
             <w:r>
               <w:rPr>
                 <w:rStyle w:val="Hyperlink"/>
                 <w:noProof/>
                 <w:lang w:val="en-IN"/>
               </w:rPr>
-              <w:t>9. Top 3 Cours</w:t>
-            </w:r>
-            <w:r>
-              <w:rPr>
-                <w:rStyle w:val="Hyperlink"/>
-                <w:noProof/>
-                <w:lang w:val="en-IN"/>
-              </w:rPr>
-              <w:t>e</w:t>
-            </w:r>
-            <w:r>
-              <w:rPr>
-                <w:rStyle w:val="Hyperlink"/>
-                <w:noProof/>
-                <w:lang w:val="en-IN"/>
-              </w:rPr>
-              <w:t>s</w:t>
+              <w:t>9. Top 3 Courses</w:t>
             </w:r>
             <w:r>
               <w:rPr>
@@ -1257,7 +1241,7 @@
                 <w:noProof/>
                 <w:webHidden/>
               </w:rPr>
-              <w:instrText xml:space="preserve"> PAGEREF _Toc193304216 \h </w:instrText>
+              <w:instrText xml:space="preserve"> PAGEREF _Toc193318603 \h </w:instrText>
             </w:r>
             <w:r>
               <w:rPr>
@@ -1289,6 +1273,79 @@
           </w:hyperlink>
         </w:p>
         <w:p>
+          <w:pPr>
+            <w:pStyle w:val="TOC1"/>
+            <w:tabs>
+              <w:tab w:val="right" w:leader="dot" w:pos="9016"/>
+            </w:tabs>
+            <w:rPr>
+              <w:rFonts w:eastAsiaTheme="minorEastAsia"/>
+              <w:noProof/>
+              <w:sz w:val="24"/>
+              <w:szCs w:val="24"/>
+              <w:lang w:eastAsia="en-GB"/>
+            </w:rPr>
+          </w:pPr>
+          <w:hyperlink w:anchor="_Toc193318604" w:history="1">
+            <w:r>
+              <w:rPr>
+                <w:rStyle w:val="Hyperlink"/>
+                <w:noProof/>
+                <w:lang w:val="en-IN"/>
+              </w:rPr>
+              <w:t>10. Top 3 Courses</w:t>
+            </w:r>
+            <w:r>
+              <w:rPr>
+                <w:noProof/>
+                <w:webHidden/>
+              </w:rPr>
+              <w:tab/>
+            </w:r>
+            <w:r>
+              <w:rPr>
+                <w:noProof/>
+                <w:webHidden/>
+              </w:rPr>
+              <w:fldChar w:fldCharType="begin"/>
+            </w:r>
+            <w:r>
+              <w:rPr>
+                <w:noProof/>
+                <w:webHidden/>
+              </w:rPr>
+              <w:instrText xml:space="preserve"> PAGEREF _Toc193318604 \h </w:instrText>
+            </w:r>
+            <w:r>
+              <w:rPr>
+                <w:noProof/>
+                <w:webHidden/>
+              </w:rPr>
+            </w:r>
+            <w:r>
+              <w:rPr>
+                <w:noProof/>
+                <w:webHidden/>
+              </w:rPr>
+              <w:fldChar w:fldCharType="separate"/>
+            </w:r>
+            <w:r>
+              <w:rPr>
+                <w:noProof/>
+                <w:webHidden/>
+              </w:rPr>
+              <w:t>15</w:t>
+            </w:r>
+            <w:r>
+              <w:rPr>
+                <w:noProof/>
+                <w:webHidden/>
+              </w:rPr>
+              <w:fldChar w:fldCharType="end"/>
+            </w:r>
+          </w:hyperlink>
+        </w:p>
+        <w:p>
           <w:r>
             <w:fldChar w:fldCharType="end"/>
           </w:r>
@@ -1509,7 +1566,7 @@
           <w:lang w:val="en-IN"/>
         </w:rPr>
       </w:pPr>
-      <w:bookmarkStart w:id="0" w:name="_Toc193304208"/>
+      <w:bookmarkStart w:id="0" w:name="_Toc193318595"/>
       <w:r>
         <w:rPr>
           <w:lang w:val="en-IN"/>
@@ -1841,7 +1898,7 @@
           <w:lang w:val="en-IN"/>
         </w:rPr>
       </w:pPr>
-      <w:bookmarkStart w:id="1" w:name="_Toc193304209"/>
+      <w:bookmarkStart w:id="1" w:name="_Toc193318596"/>
       <w:r>
         <w:rPr>
           <w:lang w:val="en-IN"/>
@@ -2057,7 +2114,7 @@
           <w:lang w:val="en-IN"/>
         </w:rPr>
       </w:pPr>
-      <w:bookmarkStart w:id="2" w:name="_Toc193304210"/>
+      <w:bookmarkStart w:id="2" w:name="_Toc193318597"/>
       <w:r>
         <w:rPr>
           <w:lang w:val="en-IN"/>
@@ -2321,7 +2378,7 @@
           <w:lang w:val="en-IN"/>
         </w:rPr>
       </w:pPr>
-      <w:bookmarkStart w:id="3" w:name="_Toc193304211"/>
+      <w:bookmarkStart w:id="3" w:name="_Toc193318598"/>
       <w:r>
         <w:rPr>
           <w:lang w:val="en-IN"/>
@@ -2625,7 +2682,7 @@
           <w:lang w:val="en-IN"/>
         </w:rPr>
       </w:pPr>
-      <w:bookmarkStart w:id="4" w:name="_Toc193304212"/>
+      <w:bookmarkStart w:id="4" w:name="_Toc193318599"/>
       <w:r>
         <w:rPr>
           <w:lang w:val="en-IN"/>
@@ -2834,7 +2891,7 @@
           <w:lang w:val="en-IN"/>
         </w:rPr>
       </w:pPr>
-      <w:bookmarkStart w:id="5" w:name="_Toc193304213"/>
+      <w:bookmarkStart w:id="5" w:name="_Toc193318600"/>
       <w:r>
         <w:rPr>
           <w:lang w:val="en-IN"/>
@@ -2998,11 +3055,20 @@
           <w:b/>
           <w:bCs/>
         </w:rPr>
-        <w:t xml:space="preserve">Dynamic Leaderboard Display </w:t>
+        <w:t xml:space="preserve">Dynamic Leaderboard </w:t>
+      </w:r>
+      <w:proofErr w:type="gramStart"/>
+      <w:r>
+        <w:rPr>
+          <w:b/>
+          <w:bCs/>
+        </w:rPr>
+        <w:t xml:space="preserve">Display </w:t>
       </w:r>
       <w:r>
         <w:t>:</w:t>
       </w:r>
+      <w:proofErr w:type="gramEnd"/>
     </w:p>
     <w:p>
       <w:pPr>
@@ -3031,6 +3097,7 @@
       <w:pPr>
         <w:ind w:left="720"/>
       </w:pPr>
+      <w:proofErr w:type="gramStart"/>
       <w:r>
         <w:rPr>
           <w:b/>
@@ -3041,6 +3108,7 @@
       <w:r>
         <w:t>:</w:t>
       </w:r>
+      <w:proofErr w:type="gramEnd"/>
     </w:p>
     <w:p>
       <w:pPr>
@@ -3073,11 +3141,20 @@
           <w:b/>
           <w:bCs/>
         </w:rPr>
-        <w:t xml:space="preserve">Refresh Button </w:t>
+        <w:t xml:space="preserve">Refresh </w:t>
+      </w:r>
+      <w:proofErr w:type="gramStart"/>
+      <w:r>
+        <w:rPr>
+          <w:b/>
+          <w:bCs/>
+        </w:rPr>
+        <w:t xml:space="preserve">Button </w:t>
       </w:r>
       <w:r>
         <w:t>:</w:t>
       </w:r>
+      <w:proofErr w:type="gramEnd"/>
     </w:p>
     <w:p>
       <w:pPr>
@@ -3099,11 +3176,20 @@
           <w:b/>
           <w:bCs/>
         </w:rPr>
-        <w:t xml:space="preserve">Row Details </w:t>
+        <w:t xml:space="preserve">Row </w:t>
+      </w:r>
+      <w:proofErr w:type="gramStart"/>
+      <w:r>
+        <w:rPr>
+          <w:b/>
+          <w:bCs/>
+        </w:rPr>
+        <w:t xml:space="preserve">Details </w:t>
       </w:r>
       <w:r>
         <w:t>:</w:t>
       </w:r>
+      <w:proofErr w:type="gramEnd"/>
     </w:p>
     <w:p>
       <w:pPr>
@@ -3120,6 +3206,7 @@
       <w:pPr>
         <w:ind w:left="720"/>
       </w:pPr>
+      <w:proofErr w:type="gramStart"/>
       <w:r>
         <w:rPr>
           <w:b/>
@@ -3130,6 +3217,7 @@
       <w:r>
         <w:t>:</w:t>
       </w:r>
+      <w:proofErr w:type="gramEnd"/>
     </w:p>
     <w:p>
       <w:pPr>
@@ -3197,11 +3285,20 @@
           <w:b/>
           <w:bCs/>
         </w:rPr>
-        <w:t xml:space="preserve">"Student XP Leaderboard" </w:t>
+        <w:t>"Student XP Leaderboard</w:t>
+      </w:r>
+      <w:proofErr w:type="gramStart"/>
+      <w:r>
+        <w:rPr>
+          <w:b/>
+          <w:bCs/>
+        </w:rPr>
+        <w:t xml:space="preserve">" </w:t>
       </w:r>
       <w:r>
         <w:t>.</w:t>
       </w:r>
+      <w:proofErr w:type="gramEnd"/>
     </w:p>
     <w:p>
       <w:pPr>
@@ -3239,6 +3336,7 @@
       </w:r>
     </w:p>
     <w:p>
+      <w:proofErr w:type="gramStart"/>
       <w:r>
         <w:rPr>
           <w:b/>
@@ -3247,10 +3345,15 @@
         <w:t xml:space="preserve">Rank </w:t>
       </w:r>
       <w:r>
-        <w:t>: The student's position based on XP.</w:t>
-      </w:r>
-    </w:p>
-    <w:p>
+        <w:t>:</w:t>
+      </w:r>
+      <w:proofErr w:type="gramEnd"/>
+      <w:r>
+        <w:t xml:space="preserve"> The student's position based on XP.</w:t>
+      </w:r>
+    </w:p>
+    <w:p>
+      <w:proofErr w:type="gramStart"/>
       <w:r>
         <w:rPr>
           <w:b/>
@@ -3259,10 +3362,15 @@
         <w:t xml:space="preserve">Username </w:t>
       </w:r>
       <w:r>
-        <w:t>: The name of the student.</w:t>
-      </w:r>
-    </w:p>
-    <w:p>
+        <w:t>:</w:t>
+      </w:r>
+      <w:proofErr w:type="gramEnd"/>
+      <w:r>
+        <w:t xml:space="preserve"> The name of the student.</w:t>
+      </w:r>
+    </w:p>
+    <w:p>
+      <w:proofErr w:type="gramStart"/>
       <w:r>
         <w:rPr>
           <w:b/>
@@ -3271,7 +3379,11 @@
         <w:t xml:space="preserve">XP </w:t>
       </w:r>
       <w:r>
-        <w:t>: The student's experience points.</w:t>
+        <w:t>:</w:t>
+      </w:r>
+      <w:proofErr w:type="gramEnd"/>
+      <w:r>
+        <w:t xml:space="preserve"> The student's experience points.</w:t>
       </w:r>
     </w:p>
     <w:p>
@@ -3315,6 +3427,7 @@
       <w:pPr>
         <w:ind w:left="1440"/>
       </w:pPr>
+      <w:proofErr w:type="gramStart"/>
       <w:r>
         <w:rPr>
           <w:b/>
@@ -3323,13 +3436,18 @@
         <w:t xml:space="preserve">Previous </w:t>
       </w:r>
       <w:r>
-        <w:t>: Navigate to the previous page of students.</w:t>
+        <w:t>:</w:t>
+      </w:r>
+      <w:proofErr w:type="gramEnd"/>
+      <w:r>
+        <w:t xml:space="preserve"> Navigate to the previous page of students.</w:t>
       </w:r>
     </w:p>
     <w:p>
       <w:pPr>
         <w:ind w:left="1440"/>
       </w:pPr>
+      <w:proofErr w:type="gramStart"/>
       <w:r>
         <w:rPr>
           <w:b/>
@@ -3338,13 +3456,18 @@
         <w:t xml:space="preserve">Next </w:t>
       </w:r>
       <w:r>
-        <w:t>: Navigate to the next page of students.</w:t>
+        <w:t>:</w:t>
+      </w:r>
+      <w:proofErr w:type="gramEnd"/>
+      <w:r>
+        <w:t xml:space="preserve"> Navigate to the next page of students.</w:t>
       </w:r>
     </w:p>
     <w:p>
       <w:pPr>
         <w:ind w:left="1440"/>
       </w:pPr>
+      <w:proofErr w:type="gramStart"/>
       <w:r>
         <w:rPr>
           <w:b/>
@@ -3353,7 +3476,11 @@
         <w:t xml:space="preserve">Refresh </w:t>
       </w:r>
       <w:r>
-        <w:t>: Reload the data from the database to reflect any changes.</w:t>
+        <w:t>:</w:t>
+      </w:r>
+      <w:proofErr w:type="gramEnd"/>
+      <w:r>
+        <w:t xml:space="preserve"> Reload the data from the database to reflect any changes.</w:t>
       </w:r>
     </w:p>
     <w:p>
@@ -3422,11 +3549,20 @@
           <w:b/>
           <w:bCs/>
         </w:rPr>
-        <w:t xml:space="preserve">View Student Details </w:t>
+        <w:t xml:space="preserve">View Student </w:t>
+      </w:r>
+      <w:proofErr w:type="gramStart"/>
+      <w:r>
+        <w:rPr>
+          <w:b/>
+          <w:bCs/>
+        </w:rPr>
+        <w:t xml:space="preserve">Details </w:t>
       </w:r>
       <w:r>
         <w:t>:</w:t>
       </w:r>
+      <w:proofErr w:type="gramEnd"/>
     </w:p>
     <w:p>
       <w:pPr>
@@ -3449,11 +3585,20 @@
           <w:b/>
           <w:bCs/>
         </w:rPr>
-        <w:t xml:space="preserve">Navigate Pages </w:t>
+        <w:t xml:space="preserve">Navigate </w:t>
+      </w:r>
+      <w:proofErr w:type="gramStart"/>
+      <w:r>
+        <w:rPr>
+          <w:b/>
+          <w:bCs/>
+        </w:rPr>
+        <w:t xml:space="preserve">Pages </w:t>
       </w:r>
       <w:r>
         <w:t>:</w:t>
       </w:r>
+      <w:proofErr w:type="gramEnd"/>
     </w:p>
     <w:p>
       <w:pPr>
@@ -3495,11 +3640,20 @@
           <w:b/>
           <w:bCs/>
         </w:rPr>
-        <w:t xml:space="preserve">Refresh Data </w:t>
+        <w:t xml:space="preserve">Refresh </w:t>
+      </w:r>
+      <w:proofErr w:type="gramStart"/>
+      <w:r>
+        <w:rPr>
+          <w:b/>
+          <w:bCs/>
+        </w:rPr>
+        <w:t xml:space="preserve">Data </w:t>
       </w:r>
       <w:r>
         <w:t>:</w:t>
       </w:r>
+      <w:proofErr w:type="gramEnd"/>
     </w:p>
     <w:p>
       <w:pPr>
@@ -3599,7 +3753,7 @@
           <w:lang w:val="en-IN"/>
         </w:rPr>
       </w:pPr>
-      <w:bookmarkStart w:id="6" w:name="_Toc193304214"/>
+      <w:bookmarkStart w:id="6" w:name="_Toc193318601"/>
       <w:r>
         <w:rPr>
           <w:lang w:val="en-IN"/>
@@ -4136,7 +4290,7 @@
           <w:lang w:val="en-IN"/>
         </w:rPr>
       </w:pPr>
-      <w:bookmarkStart w:id="7" w:name="_Toc193304215"/>
+      <w:bookmarkStart w:id="7" w:name="_Toc193318602"/>
       <w:r>
         <w:lastRenderedPageBreak/>
         <w:t>8. Flashcard maker</w:t>
@@ -4267,7 +4421,13 @@
         </w:rPr>
       </w:pPr>
       <w:r>
-        <w:t>This program works by first having the user to create their flashcards with the help of validations and other features of the program such as the remove button if they don’t want the flashcard any more. This ensures that no issues arise in the next phase and that the flashcards are accurately correct to what the user wants.</w:t>
+        <w:t xml:space="preserve">This program works by first having the user to create their flashcards with the help of validations and other features of the program such as the remove button if they don’t want the flashcard </w:t>
+      </w:r>
+      <w:r>
+        <w:t>anymore</w:t>
+      </w:r>
+      <w:r>
+        <w:t>. This ensures that no issues arise in the next phase and that the flashcards are accurately correct to what the user wants.</w:t>
       </w:r>
     </w:p>
     <w:p>
@@ -4404,7 +4564,15 @@
         </w:rPr>
       </w:pPr>
       <w:r>
-        <w:t>After the user is happy with their flashcards they can participate in the game mode to test their knowledge in a timely manner if they would like to. The user will be first asked to select how long they would want their timer to be on for with a range of options from 2mins, 5mins, 10mins of unlimited time.</w:t>
+        <w:t xml:space="preserve">After the user is happy with their </w:t>
+      </w:r>
+      <w:proofErr w:type="gramStart"/>
+      <w:r>
+        <w:t>flashcards</w:t>
+      </w:r>
+      <w:proofErr w:type="gramEnd"/>
+      <w:r>
+        <w:t xml:space="preserve"> they can participate in the game mode to test their knowledge in a timely manner if they would like to. The user will be first asked to select how long they would want their timer to be on for with a range of options from 2mins, 5mins, 10mins of unlimited time.</w:t>
       </w:r>
     </w:p>
     <w:p>
@@ -4596,7 +4764,35 @@
         <w:rPr>
           <w:lang w:val="en-IN"/>
         </w:rPr>
-        <w:t>After the last question had been answered the users results will appear to show how they have performed, with data such as what percentage they received so they can reflect on their attempt. A summary will be shown and the user can decide if to play again or go back to the main menu.</w:t>
+        <w:t xml:space="preserve">After the last question had been answered the </w:t>
+      </w:r>
+      <w:proofErr w:type="gramStart"/>
+      <w:r>
+        <w:rPr>
+          <w:lang w:val="en-IN"/>
+        </w:rPr>
+        <w:t>users</w:t>
+      </w:r>
+      <w:proofErr w:type="gramEnd"/>
+      <w:r>
+        <w:rPr>
+          <w:lang w:val="en-IN"/>
+        </w:rPr>
+        <w:t xml:space="preserve"> results will appear to show how they have performed, with data such as what percentage they received so they can reflect on their attempt. A summary will be </w:t>
+      </w:r>
+      <w:proofErr w:type="gramStart"/>
+      <w:r>
+        <w:rPr>
+          <w:lang w:val="en-IN"/>
+        </w:rPr>
+        <w:t>shown</w:t>
+      </w:r>
+      <w:proofErr w:type="gramEnd"/>
+      <w:r>
+        <w:rPr>
+          <w:lang w:val="en-IN"/>
+        </w:rPr>
+        <w:t xml:space="preserve"> and the user can decide if to play again or go back to the main menu.</w:t>
       </w:r>
     </w:p>
     <w:p>
@@ -4741,7 +4937,7 @@
           <w:lang w:val="en-IN"/>
         </w:rPr>
       </w:pPr>
-      <w:bookmarkStart w:id="8" w:name="_Toc193304216"/>
+      <w:bookmarkStart w:id="8" w:name="_Toc193318603"/>
       <w:r>
         <w:rPr>
           <w:lang w:val="en-IN"/>
@@ -4770,7 +4966,7 @@
           <w:bCs/>
           <w:lang w:val="en-IN"/>
         </w:rPr>
-        <w:t xml:space="preserve">Overview: </w:t>
+        <w:t xml:space="preserve">Overview: Shows the </w:t>
       </w:r>
       <w:r>
         <w:rPr>
@@ -4778,7 +4974,7 @@
           <w:bCs/>
           <w:lang w:val="en-IN"/>
         </w:rPr>
-        <w:t xml:space="preserve">Shows the </w:t>
+        <w:t xml:space="preserve">user the </w:t>
       </w:r>
       <w:r>
         <w:rPr>
@@ -4786,7 +4982,19 @@
           <w:bCs/>
           <w:lang w:val="en-IN"/>
         </w:rPr>
-        <w:t xml:space="preserve">user the </w:t>
+        <w:t>top 3 most popular courses</w:t>
+      </w:r>
+      <w:r>
+        <w:rPr>
+          <w:lang w:val="en-IN"/>
+        </w:rPr>
+        <w:t xml:space="preserve"> </w:t>
+      </w:r>
+      <w:r>
+        <w:rPr>
+          <w:lang w:val="en-IN"/>
+        </w:rPr>
+        <w:br/>
       </w:r>
       <w:r>
         <w:rPr>
@@ -4794,26 +5002,6 @@
           <w:bCs/>
           <w:lang w:val="en-IN"/>
         </w:rPr>
-        <w:t>top 3 most popular courses</w:t>
-      </w:r>
-      <w:r>
-        <w:rPr>
-          <w:lang w:val="en-IN"/>
-        </w:rPr>
-        <w:t xml:space="preserve"> </w:t>
-      </w:r>
-      <w:r>
-        <w:rPr>
-          <w:lang w:val="en-IN"/>
-        </w:rPr>
-        <w:br/>
-      </w:r>
-      <w:r>
-        <w:rPr>
-          <w:b/>
-          <w:bCs/>
-          <w:lang w:val="en-IN"/>
-        </w:rPr>
         <w:t>Steps to Use:</w:t>
       </w:r>
     </w:p>
@@ -4852,6 +5040,7 @@
       </w:pPr>
       <w:r>
         <w:rPr>
+          <w:noProof/>
           <w:lang w:val="en-IN"/>
         </w:rPr>
         <w:drawing>
@@ -4900,6 +5089,7 @@
       </w:pPr>
       <w:r>
         <w:rPr>
+          <w:noProof/>
           <w:lang w:val="en-IN"/>
         </w:rPr>
         <w:drawing>
@@ -5010,6 +5200,7 @@
       </w:pPr>
       <w:r>
         <w:rPr>
+          <w:noProof/>
           <w:lang w:val="en-IN"/>
         </w:rPr>
         <w:lastRenderedPageBreak/>
@@ -5059,24 +5250,1350 @@
     </w:p>
     <w:p>
       <w:pPr>
-        <w:rPr>
-          <w:lang w:val="en-IN"/>
-        </w:rPr>
-      </w:pPr>
-    </w:p>
-    <w:p>
-      <w:r>
+        <w:pStyle w:val="Heading1"/>
+        <w:rPr>
+          <w:lang w:val="en-IN"/>
+        </w:rPr>
+      </w:pPr>
+      <w:bookmarkStart w:id="9" w:name="_Toc193318604"/>
+      <w:r>
+        <w:rPr>
+          <w:lang w:val="en-IN"/>
+        </w:rPr>
+        <w:t>10</w:t>
+      </w:r>
+      <w:r>
+        <w:rPr>
+          <w:lang w:val="en-IN"/>
+        </w:rPr>
+        <w:t xml:space="preserve">. </w:t>
+      </w:r>
+      <w:bookmarkEnd w:id="9"/>
+      <w:r>
+        <w:rPr>
+          <w:lang w:val="en-IN"/>
+        </w:rPr>
+        <w:t>Goal Tracker</w:t>
+      </w:r>
+    </w:p>
+    <w:p>
+      <w:pPr>
         <w:rPr>
           <w:b/>
           <w:bCs/>
           <w:lang w:val="en-IN"/>
         </w:rPr>
+      </w:pPr>
+      <w:r>
+        <w:rPr>
+          <w:b/>
+          <w:bCs/>
+          <w:lang w:val="en-IN"/>
+        </w:rPr>
+        <w:t xml:space="preserve">Overview: </w:t>
+      </w:r>
+      <w:r>
+        <w:rPr>
+          <w:b/>
+          <w:bCs/>
+          <w:lang w:val="en-IN"/>
+        </w:rPr>
+        <w:t>Allows the user to set, edit, and delete personalised goals</w:t>
+      </w:r>
+      <w:r>
+        <w:rPr>
+          <w:lang w:val="en-IN"/>
+        </w:rPr>
+        <w:br/>
+      </w:r>
+    </w:p>
+    <w:p>
+      <w:pPr>
+        <w:rPr>
+          <w:b/>
+          <w:bCs/>
+          <w:lang w:val="en-IN"/>
+        </w:rPr>
+      </w:pPr>
+      <w:r>
+        <w:rPr>
+          <w:b/>
+          <w:bCs/>
+          <w:lang w:val="en-IN"/>
+        </w:rPr>
+        <w:t>Steps to Use:</w:t>
+      </w:r>
+    </w:p>
+    <w:p>
+      <w:pPr>
+        <w:pStyle w:val="ListParagraph"/>
+        <w:numPr>
+          <w:ilvl w:val="0"/>
+          <w:numId w:val="12"/>
+        </w:numPr>
+        <w:rPr>
+          <w:lang w:val="en-IN"/>
+        </w:rPr>
+      </w:pPr>
+      <w:r>
+        <w:rPr>
+          <w:lang w:val="en-IN"/>
+        </w:rPr>
+        <w:t>Accessing the Goals Tracker:</w:t>
+      </w:r>
+    </w:p>
+    <w:p>
+      <w:pPr>
+        <w:pStyle w:val="ListParagraph"/>
+        <w:numPr>
+          <w:ilvl w:val="1"/>
+          <w:numId w:val="12"/>
+        </w:numPr>
+        <w:rPr>
+          <w:lang w:val="en-IN"/>
+        </w:rPr>
+      </w:pPr>
+      <w:r>
+        <w:rPr>
+          <w:lang w:val="en-IN"/>
+        </w:rPr>
+        <w:t>Once the user logs into their account and clicks on the goal tracker button in the sidebar on the dashboard they will enter the Goals Tracker page.</w:t>
+      </w:r>
+    </w:p>
+    <w:p>
+      <w:pPr>
+        <w:pStyle w:val="ListParagraph"/>
+        <w:numPr>
+          <w:ilvl w:val="1"/>
+          <w:numId w:val="12"/>
+        </w:numPr>
+        <w:rPr>
+          <w:lang w:val="en-IN"/>
+        </w:rPr>
+      </w:pPr>
+      <w:r>
+        <w:rPr>
+          <w:lang w:val="en-IN"/>
+        </w:rPr>
+        <w:t xml:space="preserve">The Goals Tracker displays a list of each of the three states that a goal can inhabit. </w:t>
+      </w:r>
+    </w:p>
+    <w:p>
+      <w:pPr>
+        <w:pStyle w:val="ListParagraph"/>
+        <w:numPr>
+          <w:ilvl w:val="2"/>
+          <w:numId w:val="12"/>
+        </w:numPr>
+        <w:rPr>
+          <w:lang w:val="en-IN"/>
+        </w:rPr>
+      </w:pPr>
+      <w:r>
+        <w:rPr>
+          <w:lang w:val="en-IN"/>
+        </w:rPr>
+        <w:t>Active Goals</w:t>
+      </w:r>
+      <w:r>
+        <w:rPr>
+          <w:lang w:val="en-IN"/>
+        </w:rPr>
+        <w:t xml:space="preserve">: </w:t>
+      </w:r>
+      <w:r>
+        <w:rPr>
+          <w:lang w:val="en-IN"/>
+        </w:rPr>
+        <w:t>the goal has been set</w:t>
+      </w:r>
+      <w:r>
+        <w:rPr>
+          <w:lang w:val="en-IN"/>
+        </w:rPr>
+        <w:t xml:space="preserve"> and is currently in progress</w:t>
+      </w:r>
+    </w:p>
+    <w:p>
+      <w:pPr>
+        <w:pStyle w:val="ListParagraph"/>
+        <w:numPr>
+          <w:ilvl w:val="2"/>
+          <w:numId w:val="12"/>
+        </w:numPr>
+        <w:rPr>
+          <w:lang w:val="en-IN"/>
+        </w:rPr>
+      </w:pPr>
+      <w:r>
+        <w:rPr>
+          <w:lang w:val="en-IN"/>
+        </w:rPr>
+        <w:t>Expired Goals</w:t>
+      </w:r>
+      <w:r>
+        <w:rPr>
+          <w:lang w:val="en-IN"/>
+        </w:rPr>
+        <w:t>: Goals that remain incomplete and have passed their expiration date</w:t>
+      </w:r>
+    </w:p>
+    <w:p>
+      <w:pPr>
+        <w:pStyle w:val="ListParagraph"/>
+        <w:numPr>
+          <w:ilvl w:val="2"/>
+          <w:numId w:val="12"/>
+        </w:numPr>
+        <w:rPr>
+          <w:lang w:val="en-IN"/>
+        </w:rPr>
+      </w:pPr>
+      <w:r>
+        <w:rPr>
+          <w:noProof/>
+        </w:rPr>
+        <w:drawing>
+          <wp:anchor distT="0" distB="0" distL="114300" distR="114300" simplePos="0" relativeHeight="251659264" behindDoc="0" locked="0" layoutInCell="1" allowOverlap="1" wp14:anchorId="1C1EE725" wp14:editId="0DA3EAD3">
+            <wp:simplePos x="0" y="0"/>
+            <wp:positionH relativeFrom="margin">
+              <wp:align>right</wp:align>
+            </wp:positionH>
+            <wp:positionV relativeFrom="paragraph">
+              <wp:posOffset>429260</wp:posOffset>
+            </wp:positionV>
+            <wp:extent cx="5731510" cy="3178175"/>
+            <wp:effectExtent l="0" t="0" r="2540" b="3175"/>
+            <wp:wrapSquare wrapText="bothSides"/>
+            <wp:docPr id="1915800940" name="Picture 15" descr="A screenshot of a computer&#10;&#10;AI-generated content may be incorrect."/>
+            <wp:cNvGraphicFramePr>
+              <a:graphicFrameLocks xmlns:a="http://schemas.openxmlformats.org/drawingml/2006/main" noChangeAspect="1"/>
+            </wp:cNvGraphicFramePr>
+            <a:graphic xmlns:a="http://schemas.openxmlformats.org/drawingml/2006/main">
+              <a:graphicData uri="http://schemas.openxmlformats.org/drawingml/2006/picture">
+                <pic:pic xmlns:pic="http://schemas.openxmlformats.org/drawingml/2006/picture">
+                  <pic:nvPicPr>
+                    <pic:cNvPr id="1915800940" name="Picture 15" descr="A screenshot of a computer&#10;&#10;AI-generated content may be incorrect."/>
+                    <pic:cNvPicPr>
+                      <a:picLocks noChangeAspect="1" noChangeArrowheads="1"/>
+                    </pic:cNvPicPr>
+                  </pic:nvPicPr>
+                  <pic:blipFill>
+                    <a:blip r:embed="rId35" cstate="print">
+                      <a:extLst>
+                        <a:ext uri="{28A0092B-C50C-407E-A947-70E740481C1C}">
+                          <a14:useLocalDpi xmlns:a14="http://schemas.microsoft.com/office/drawing/2010/main" val="0"/>
+                        </a:ext>
+                      </a:extLst>
+                    </a:blip>
+                    <a:srcRect/>
+                    <a:stretch>
+                      <a:fillRect/>
+                    </a:stretch>
+                  </pic:blipFill>
+                  <pic:spPr bwMode="auto">
+                    <a:xfrm>
+                      <a:off x="0" y="0"/>
+                      <a:ext cx="5731510" cy="3178175"/>
+                    </a:xfrm>
+                    <a:prstGeom prst="rect">
+                      <a:avLst/>
+                    </a:prstGeom>
+                    <a:noFill/>
+                    <a:ln>
+                      <a:noFill/>
+                    </a:ln>
+                  </pic:spPr>
+                </pic:pic>
+              </a:graphicData>
+            </a:graphic>
+          </wp:anchor>
+        </w:drawing>
+      </w:r>
+      <w:r>
+        <w:rPr>
+          <w:lang w:val="en-IN"/>
+        </w:rPr>
+        <w:t>Completed Goals: Active goals that the user has marked as complete</w:t>
+      </w:r>
+    </w:p>
+    <w:p>
+      <w:pPr>
+        <w:ind w:left="1080"/>
+        <w:rPr>
+          <w:lang w:val="en-IN"/>
+        </w:rPr>
+      </w:pPr>
+      <w:r>
+        <w:rPr>
+          <w:lang w:val="en-IN"/>
+        </w:rPr>
+        <w:t xml:space="preserve">c. If the user has already created goals the Goals Tracker will fetch </w:t>
+      </w:r>
+      <w:r>
+        <w:rPr>
+          <w:lang w:val="en-IN"/>
+        </w:rPr>
+        <w:t>their</w:t>
+      </w:r>
+      <w:r>
+        <w:rPr>
+          <w:lang w:val="en-IN"/>
+        </w:rPr>
+        <w:t xml:space="preserve"> goals and display them. </w:t>
+      </w:r>
+    </w:p>
+    <w:p>
+      <w:pPr>
+        <w:pStyle w:val="ListParagraph"/>
+        <w:numPr>
+          <w:ilvl w:val="0"/>
+          <w:numId w:val="12"/>
+        </w:numPr>
+        <w:rPr>
+          <w:lang w:val="en-IN"/>
+        </w:rPr>
+      </w:pPr>
+      <w:r>
+        <w:rPr>
+          <w:lang w:val="en-IN"/>
+        </w:rPr>
+        <w:lastRenderedPageBreak/>
+        <w:t>Adding a Goal:</w:t>
+      </w:r>
+    </w:p>
+    <w:p>
+      <w:pPr>
+        <w:pStyle w:val="ListParagraph"/>
+        <w:numPr>
+          <w:ilvl w:val="1"/>
+          <w:numId w:val="12"/>
+        </w:numPr>
+        <w:rPr>
+          <w:lang w:val="en-IN"/>
+        </w:rPr>
+      </w:pPr>
+      <w:r>
+        <w:rPr>
+          <w:lang w:val="en-IN"/>
+        </w:rPr>
+        <w:t>The user clicks the “+ Add New Goal” button in the Active Goals section.</w:t>
+      </w:r>
+    </w:p>
+    <w:p>
+      <w:pPr>
+        <w:pStyle w:val="ListParagraph"/>
+        <w:numPr>
+          <w:ilvl w:val="1"/>
+          <w:numId w:val="12"/>
+        </w:numPr>
+        <w:rPr>
+          <w:lang w:val="en-IN"/>
+        </w:rPr>
+      </w:pPr>
+      <w:r>
+        <w:rPr>
+          <w:noProof/>
+        </w:rPr>
+        <w:drawing>
+          <wp:anchor distT="0" distB="0" distL="114300" distR="114300" simplePos="0" relativeHeight="251658240" behindDoc="0" locked="0" layoutInCell="1" allowOverlap="1" wp14:anchorId="1F38339E" wp14:editId="5B53CA3B">
+            <wp:simplePos x="0" y="0"/>
+            <wp:positionH relativeFrom="margin">
+              <wp:align>right</wp:align>
+            </wp:positionH>
+            <wp:positionV relativeFrom="paragraph">
+              <wp:posOffset>249555</wp:posOffset>
+            </wp:positionV>
+            <wp:extent cx="5731510" cy="3218815"/>
+            <wp:effectExtent l="0" t="0" r="2540" b="635"/>
+            <wp:wrapSquare wrapText="bothSides"/>
+            <wp:docPr id="76574805" name="Picture 16" descr="A screenshot of a login form&#10;&#10;AI-generated content may be incorrect."/>
+            <wp:cNvGraphicFramePr>
+              <a:graphicFrameLocks xmlns:a="http://schemas.openxmlformats.org/drawingml/2006/main" noChangeAspect="1"/>
+            </wp:cNvGraphicFramePr>
+            <a:graphic xmlns:a="http://schemas.openxmlformats.org/drawingml/2006/main">
+              <a:graphicData uri="http://schemas.openxmlformats.org/drawingml/2006/picture">
+                <pic:pic xmlns:pic="http://schemas.openxmlformats.org/drawingml/2006/picture">
+                  <pic:nvPicPr>
+                    <pic:cNvPr id="76574805" name="Picture 16" descr="A screenshot of a login form&#10;&#10;AI-generated content may be incorrect."/>
+                    <pic:cNvPicPr>
+                      <a:picLocks noChangeAspect="1" noChangeArrowheads="1"/>
+                    </pic:cNvPicPr>
+                  </pic:nvPicPr>
+                  <pic:blipFill>
+                    <a:blip r:embed="rId36" cstate="print">
+                      <a:extLst>
+                        <a:ext uri="{28A0092B-C50C-407E-A947-70E740481C1C}">
+                          <a14:useLocalDpi xmlns:a14="http://schemas.microsoft.com/office/drawing/2010/main" val="0"/>
+                        </a:ext>
+                      </a:extLst>
+                    </a:blip>
+                    <a:srcRect/>
+                    <a:stretch>
+                      <a:fillRect/>
+                    </a:stretch>
+                  </pic:blipFill>
+                  <pic:spPr bwMode="auto">
+                    <a:xfrm>
+                      <a:off x="0" y="0"/>
+                      <a:ext cx="5731510" cy="3218815"/>
+                    </a:xfrm>
+                    <a:prstGeom prst="rect">
+                      <a:avLst/>
+                    </a:prstGeom>
+                    <a:noFill/>
+                    <a:ln>
+                      <a:noFill/>
+                    </a:ln>
+                  </pic:spPr>
+                </pic:pic>
+              </a:graphicData>
+            </a:graphic>
+          </wp:anchor>
+        </w:drawing>
+      </w:r>
+      <w:r>
+        <w:rPr>
+          <w:lang w:val="en-IN"/>
+        </w:rPr>
+        <w:t>The user will then be redirected to the Add Goal page.</w:t>
+      </w:r>
+    </w:p>
+    <w:p>
+      <w:pPr>
+        <w:pStyle w:val="ListParagraph"/>
+        <w:numPr>
+          <w:ilvl w:val="1"/>
+          <w:numId w:val="12"/>
+        </w:numPr>
+        <w:rPr>
+          <w:lang w:val="en-IN"/>
+        </w:rPr>
+      </w:pPr>
+      <w:r>
+        <w:rPr>
+          <w:lang w:val="en-IN"/>
+        </w:rPr>
+        <w:t xml:space="preserve">The user will then be able to create their own personalised goal by writing the goal into the Goal Title </w:t>
+      </w:r>
+      <w:r>
+        <w:rPr>
+          <w:lang w:val="en-IN"/>
+        </w:rPr>
+        <w:t xml:space="preserve">input </w:t>
+      </w:r>
+      <w:r>
+        <w:rPr>
+          <w:lang w:val="en-IN"/>
+        </w:rPr>
+        <w:t xml:space="preserve">field or choosing a goal title from the dropdown list of pre-defined goals. </w:t>
+      </w:r>
+    </w:p>
+    <w:p>
+      <w:pPr>
+        <w:pStyle w:val="ListParagraph"/>
+        <w:ind w:left="1440"/>
+        <w:rPr>
+          <w:lang w:val="en-IN"/>
+        </w:rPr>
+      </w:pPr>
+      <w:r>
+        <w:rPr>
+          <w:noProof/>
+        </w:rPr>
+        <w:drawing>
+          <wp:inline distT="0" distB="0" distL="0" distR="0" wp14:anchorId="5098FE2A" wp14:editId="303D9C49">
+            <wp:extent cx="2831677" cy="3893321"/>
+            <wp:effectExtent l="0" t="0" r="6985" b="0"/>
+            <wp:docPr id="13192051" name="Picture 17" descr="A screenshot of a computer&#10;&#10;AI-generated content may be incorrect."/>
+            <wp:cNvGraphicFramePr>
+              <a:graphicFrameLocks xmlns:a="http://schemas.openxmlformats.org/drawingml/2006/main" noChangeAspect="1"/>
+            </wp:cNvGraphicFramePr>
+            <a:graphic xmlns:a="http://schemas.openxmlformats.org/drawingml/2006/main">
+              <a:graphicData uri="http://schemas.openxmlformats.org/drawingml/2006/picture">
+                <pic:pic xmlns:pic="http://schemas.openxmlformats.org/drawingml/2006/picture">
+                  <pic:nvPicPr>
+                    <pic:cNvPr id="13192051" name="Picture 17" descr="A screenshot of a computer&#10;&#10;AI-generated content may be incorrect."/>
+                    <pic:cNvPicPr>
+                      <a:picLocks noChangeAspect="1" noChangeArrowheads="1"/>
+                    </pic:cNvPicPr>
+                  </pic:nvPicPr>
+                  <pic:blipFill>
+                    <a:blip r:embed="rId37" cstate="print">
+                      <a:extLst>
+                        <a:ext uri="{28A0092B-C50C-407E-A947-70E740481C1C}">
+                          <a14:useLocalDpi xmlns:a14="http://schemas.microsoft.com/office/drawing/2010/main" val="0"/>
+                        </a:ext>
+                      </a:extLst>
+                    </a:blip>
+                    <a:srcRect/>
+                    <a:stretch>
+                      <a:fillRect/>
+                    </a:stretch>
+                  </pic:blipFill>
+                  <pic:spPr bwMode="auto">
+                    <a:xfrm>
+                      <a:off x="0" y="0"/>
+                      <a:ext cx="2831677" cy="3893321"/>
+                    </a:xfrm>
+                    <a:prstGeom prst="rect">
+                      <a:avLst/>
+                    </a:prstGeom>
+                    <a:noFill/>
+                    <a:ln>
+                      <a:noFill/>
+                    </a:ln>
+                  </pic:spPr>
+                </pic:pic>
+              </a:graphicData>
+            </a:graphic>
+          </wp:inline>
+        </w:drawing>
+      </w:r>
+    </w:p>
+    <w:p>
+      <w:pPr>
+        <w:pStyle w:val="ListParagraph"/>
+        <w:numPr>
+          <w:ilvl w:val="1"/>
+          <w:numId w:val="12"/>
+        </w:numPr>
+        <w:rPr>
+          <w:lang w:val="en-IN"/>
+        </w:rPr>
+      </w:pPr>
+      <w:r>
+        <w:rPr>
+          <w:lang w:val="en-IN"/>
+        </w:rPr>
+        <w:t>The user can then select the duration for the goal by selecting the exact number of days, hours and minutes they want the goal to remain active for.</w:t>
+      </w:r>
+    </w:p>
+    <w:p>
+      <w:pPr>
+        <w:pStyle w:val="ListParagraph"/>
+        <w:ind w:left="1440"/>
+        <w:rPr>
+          <w:lang w:val="en-IN"/>
+        </w:rPr>
+      </w:pPr>
+      <w:r>
+        <w:rPr>
+          <w:noProof/>
+        </w:rPr>
+        <w:lastRenderedPageBreak/>
+        <w:drawing>
+          <wp:inline distT="0" distB="0" distL="0" distR="0" wp14:anchorId="487E8DBE" wp14:editId="49BB4472">
+            <wp:extent cx="2799903" cy="3716867"/>
+            <wp:effectExtent l="0" t="0" r="635" b="0"/>
+            <wp:docPr id="43031489" name="Picture 18" descr="A screenshot of a computer screen&#10;&#10;AI-generated content may be incorrect."/>
+            <wp:cNvGraphicFramePr>
+              <a:graphicFrameLocks xmlns:a="http://schemas.openxmlformats.org/drawingml/2006/main" noChangeAspect="1"/>
+            </wp:cNvGraphicFramePr>
+            <a:graphic xmlns:a="http://schemas.openxmlformats.org/drawingml/2006/main">
+              <a:graphicData uri="http://schemas.openxmlformats.org/drawingml/2006/picture">
+                <pic:pic xmlns:pic="http://schemas.openxmlformats.org/drawingml/2006/picture">
+                  <pic:nvPicPr>
+                    <pic:cNvPr id="43031489" name="Picture 18" descr="A screenshot of a computer screen&#10;&#10;AI-generated content may be incorrect."/>
+                    <pic:cNvPicPr>
+                      <a:picLocks noChangeAspect="1" noChangeArrowheads="1"/>
+                    </pic:cNvPicPr>
+                  </pic:nvPicPr>
+                  <pic:blipFill>
+                    <a:blip r:embed="rId38" cstate="print">
+                      <a:extLst>
+                        <a:ext uri="{28A0092B-C50C-407E-A947-70E740481C1C}">
+                          <a14:useLocalDpi xmlns:a14="http://schemas.microsoft.com/office/drawing/2010/main" val="0"/>
+                        </a:ext>
+                      </a:extLst>
+                    </a:blip>
+                    <a:srcRect/>
+                    <a:stretch>
+                      <a:fillRect/>
+                    </a:stretch>
+                  </pic:blipFill>
+                  <pic:spPr bwMode="auto">
+                    <a:xfrm>
+                      <a:off x="0" y="0"/>
+                      <a:ext cx="2809166" cy="3729163"/>
+                    </a:xfrm>
+                    <a:prstGeom prst="rect">
+                      <a:avLst/>
+                    </a:prstGeom>
+                    <a:noFill/>
+                    <a:ln>
+                      <a:noFill/>
+                    </a:ln>
+                  </pic:spPr>
+                </pic:pic>
+              </a:graphicData>
+            </a:graphic>
+          </wp:inline>
+        </w:drawing>
+      </w:r>
+    </w:p>
+    <w:p>
+      <w:pPr>
+        <w:pStyle w:val="ListParagraph"/>
+        <w:numPr>
+          <w:ilvl w:val="1"/>
+          <w:numId w:val="12"/>
+        </w:numPr>
+        <w:rPr>
+          <w:lang w:val="en-IN"/>
+        </w:rPr>
+      </w:pPr>
+      <w:r>
+        <w:rPr>
+          <w:lang w:val="en-IN"/>
+        </w:rPr>
+        <w:t>The user can then click the “Create Goal” button to redirect the user back to the goals page with the new goal now displayed in the Active Goals list.</w:t>
+      </w:r>
+    </w:p>
+    <w:p>
+      <w:pPr>
+        <w:pStyle w:val="ListParagraph"/>
+        <w:numPr>
+          <w:ilvl w:val="0"/>
+          <w:numId w:val="12"/>
+        </w:numPr>
+        <w:rPr>
+          <w:lang w:val="en-IN"/>
+        </w:rPr>
+      </w:pPr>
+      <w:r>
+        <w:rPr>
+          <w:lang w:val="en-IN"/>
+        </w:rPr>
+        <w:t>Editing a Goal:</w:t>
+      </w:r>
+    </w:p>
+    <w:p>
+      <w:pPr>
+        <w:pStyle w:val="ListParagraph"/>
+        <w:numPr>
+          <w:ilvl w:val="1"/>
+          <w:numId w:val="12"/>
+        </w:numPr>
+        <w:rPr>
+          <w:lang w:val="en-IN"/>
+        </w:rPr>
+      </w:pPr>
+      <w:r>
+        <w:rPr>
+          <w:lang w:val="en-IN"/>
+        </w:rPr>
+        <w:t xml:space="preserve">On the Goal Tracker </w:t>
+      </w:r>
+      <w:r>
+        <w:rPr>
+          <w:lang w:val="en-IN"/>
+        </w:rPr>
+        <w:t>page,</w:t>
+      </w:r>
+      <w:r>
+        <w:rPr>
+          <w:lang w:val="en-IN"/>
+        </w:rPr>
+        <w:t xml:space="preserve"> the user can choose to edit a goal by clicking the “Edit Goal” button next to the specific goal that they want to edit.</w:t>
+      </w:r>
+    </w:p>
+    <w:p>
+      <w:pPr>
+        <w:pStyle w:val="ListParagraph"/>
+        <w:numPr>
+          <w:ilvl w:val="1"/>
+          <w:numId w:val="12"/>
+        </w:numPr>
+        <w:rPr>
+          <w:lang w:val="en-IN"/>
+        </w:rPr>
+      </w:pPr>
+      <w:r>
+        <w:rPr>
+          <w:lang w:val="en-IN"/>
+        </w:rPr>
+        <w:t>The user will then be redirected to the Edit Goals page.</w:t>
+      </w:r>
+    </w:p>
+    <w:p>
+      <w:pPr>
+        <w:pStyle w:val="ListParagraph"/>
+        <w:numPr>
+          <w:ilvl w:val="1"/>
+          <w:numId w:val="12"/>
+        </w:numPr>
+        <w:rPr>
+          <w:lang w:val="en-IN"/>
+        </w:rPr>
+      </w:pPr>
+      <w:r>
+        <w:rPr>
+          <w:lang w:val="en-IN"/>
+        </w:rPr>
+        <w:t>The user can now select which specific element of the goal they want to change (either the goal title or the goal duration).</w:t>
+      </w:r>
+    </w:p>
+    <w:p>
+      <w:pPr>
+        <w:pStyle w:val="ListParagraph"/>
+        <w:numPr>
+          <w:ilvl w:val="1"/>
+          <w:numId w:val="12"/>
+        </w:numPr>
+        <w:rPr>
+          <w:lang w:val="en-IN"/>
+        </w:rPr>
+      </w:pPr>
+      <w:r>
+        <w:rPr>
+          <w:lang w:val="en-IN"/>
+        </w:rPr>
+        <w:t xml:space="preserve">The user can then click on the “Update Goal” button to save the changes </w:t>
+      </w:r>
+      <w:r>
+        <w:rPr>
+          <w:lang w:val="en-IN"/>
+        </w:rPr>
+        <w:t>to the goal and redirect back to the Goal Tracker page with the edited details of the goal inside the Active Goals list.</w:t>
+      </w:r>
+    </w:p>
+    <w:p>
+      <w:pPr>
+        <w:pStyle w:val="ListParagraph"/>
+        <w:numPr>
+          <w:ilvl w:val="0"/>
+          <w:numId w:val="12"/>
+        </w:numPr>
+        <w:rPr>
+          <w:lang w:val="en-IN"/>
+        </w:rPr>
+      </w:pPr>
+      <w:r>
+        <w:rPr>
+          <w:lang w:val="en-IN"/>
+        </w:rPr>
+        <w:t>Completing a Goal:</w:t>
+      </w:r>
+    </w:p>
+    <w:p>
+      <w:pPr>
+        <w:pStyle w:val="ListParagraph"/>
+        <w:numPr>
+          <w:ilvl w:val="1"/>
+          <w:numId w:val="12"/>
+        </w:numPr>
+        <w:rPr>
+          <w:lang w:val="en-IN"/>
+        </w:rPr>
+      </w:pPr>
+      <w:r>
+        <w:rPr>
+          <w:lang w:val="en-IN"/>
+        </w:rPr>
+        <w:t>Inside the Active Goals list the user can select a goal that they want to complete.</w:t>
+      </w:r>
+    </w:p>
+    <w:p>
+      <w:pPr>
+        <w:pStyle w:val="ListParagraph"/>
+        <w:ind w:left="1440"/>
+        <w:rPr>
+          <w:lang w:val="en-IN"/>
+        </w:rPr>
+      </w:pPr>
+      <w:r>
+        <w:rPr>
+          <w:noProof/>
+        </w:rPr>
+        <w:drawing>
+          <wp:inline distT="0" distB="0" distL="0" distR="0" wp14:anchorId="75F5585D" wp14:editId="14979DC5">
+            <wp:extent cx="4278731" cy="2730500"/>
+            <wp:effectExtent l="0" t="0" r="7620" b="0"/>
+            <wp:docPr id="2142742414" name="Picture 19" descr="A screenshot of a tracker&#10;&#10;AI-generated content may be incorrect."/>
+            <wp:cNvGraphicFramePr>
+              <a:graphicFrameLocks xmlns:a="http://schemas.openxmlformats.org/drawingml/2006/main" noChangeAspect="1"/>
+            </wp:cNvGraphicFramePr>
+            <a:graphic xmlns:a="http://schemas.openxmlformats.org/drawingml/2006/main">
+              <a:graphicData uri="http://schemas.openxmlformats.org/drawingml/2006/picture">
+                <pic:pic xmlns:pic="http://schemas.openxmlformats.org/drawingml/2006/picture">
+                  <pic:nvPicPr>
+                    <pic:cNvPr id="2142742414" name="Picture 19" descr="A screenshot of a tracker&#10;&#10;AI-generated content may be incorrect."/>
+                    <pic:cNvPicPr>
+                      <a:picLocks noChangeAspect="1" noChangeArrowheads="1"/>
+                    </pic:cNvPicPr>
+                  </pic:nvPicPr>
+                  <pic:blipFill>
+                    <a:blip r:embed="rId39" cstate="print">
+                      <a:extLst>
+                        <a:ext uri="{28A0092B-C50C-407E-A947-70E740481C1C}">
+                          <a14:useLocalDpi xmlns:a14="http://schemas.microsoft.com/office/drawing/2010/main" val="0"/>
+                        </a:ext>
+                      </a:extLst>
+                    </a:blip>
+                    <a:srcRect/>
+                    <a:stretch>
+                      <a:fillRect/>
+                    </a:stretch>
+                  </pic:blipFill>
+                  <pic:spPr bwMode="auto">
+                    <a:xfrm>
+                      <a:off x="0" y="0"/>
+                      <a:ext cx="4357502" cy="2780768"/>
+                    </a:xfrm>
+                    <a:prstGeom prst="rect">
+                      <a:avLst/>
+                    </a:prstGeom>
+                    <a:noFill/>
+                    <a:ln>
+                      <a:noFill/>
+                    </a:ln>
+                  </pic:spPr>
+                </pic:pic>
+              </a:graphicData>
+            </a:graphic>
+          </wp:inline>
+        </w:drawing>
+      </w:r>
+    </w:p>
+    <w:p>
+      <w:pPr>
+        <w:pStyle w:val="ListParagraph"/>
+        <w:numPr>
+          <w:ilvl w:val="1"/>
+          <w:numId w:val="12"/>
+        </w:numPr>
+        <w:rPr>
+          <w:lang w:val="en-IN"/>
+        </w:rPr>
+      </w:pPr>
+      <w:r>
+        <w:rPr>
+          <w:lang w:val="en-IN"/>
+        </w:rPr>
+        <w:lastRenderedPageBreak/>
+        <w:t>The user can then click on the “Complete” button next to the goal that they want to complete.</w:t>
+      </w:r>
+    </w:p>
+    <w:p>
+      <w:pPr>
+        <w:pStyle w:val="ListParagraph"/>
+        <w:numPr>
+          <w:ilvl w:val="1"/>
+          <w:numId w:val="12"/>
+        </w:numPr>
+        <w:rPr>
+          <w:lang w:val="en-IN"/>
+        </w:rPr>
+      </w:pPr>
+      <w:r>
+        <w:rPr>
+          <w:lang w:val="en-IN"/>
+        </w:rPr>
+        <w:t>Now that the goal has been marked as completed it will then be moved into the Completed Goals list where it will now display its completion date.</w:t>
+      </w:r>
+    </w:p>
+    <w:p>
+      <w:pPr>
+        <w:pStyle w:val="ListParagraph"/>
+        <w:ind w:left="1440"/>
+        <w:rPr>
+          <w:lang w:val="en-IN"/>
+        </w:rPr>
+      </w:pPr>
+      <w:r>
+        <w:rPr>
+          <w:noProof/>
+        </w:rPr>
+        <w:drawing>
+          <wp:inline distT="0" distB="0" distL="0" distR="0" wp14:anchorId="127BA806" wp14:editId="45F9A0B8">
+            <wp:extent cx="5078907" cy="3224256"/>
+            <wp:effectExtent l="0" t="0" r="7620" b="0"/>
+            <wp:docPr id="304481414" name="Picture 20" descr="A screenshot of a computer&#10;&#10;AI-generated content may be incorrect."/>
+            <wp:cNvGraphicFramePr>
+              <a:graphicFrameLocks xmlns:a="http://schemas.openxmlformats.org/drawingml/2006/main" noChangeAspect="1"/>
+            </wp:cNvGraphicFramePr>
+            <a:graphic xmlns:a="http://schemas.openxmlformats.org/drawingml/2006/main">
+              <a:graphicData uri="http://schemas.openxmlformats.org/drawingml/2006/picture">
+                <pic:pic xmlns:pic="http://schemas.openxmlformats.org/drawingml/2006/picture">
+                  <pic:nvPicPr>
+                    <pic:cNvPr id="304481414" name="Picture 20" descr="A screenshot of a computer&#10;&#10;AI-generated content may be incorrect."/>
+                    <pic:cNvPicPr>
+                      <a:picLocks noChangeAspect="1" noChangeArrowheads="1"/>
+                    </pic:cNvPicPr>
+                  </pic:nvPicPr>
+                  <pic:blipFill>
+                    <a:blip r:embed="rId40" cstate="print">
+                      <a:extLst>
+                        <a:ext uri="{28A0092B-C50C-407E-A947-70E740481C1C}">
+                          <a14:useLocalDpi xmlns:a14="http://schemas.microsoft.com/office/drawing/2010/main" val="0"/>
+                        </a:ext>
+                      </a:extLst>
+                    </a:blip>
+                    <a:srcRect/>
+                    <a:stretch>
+                      <a:fillRect/>
+                    </a:stretch>
+                  </pic:blipFill>
+                  <pic:spPr bwMode="auto">
+                    <a:xfrm>
+                      <a:off x="0" y="0"/>
+                      <a:ext cx="5088158" cy="3230129"/>
+                    </a:xfrm>
+                    <a:prstGeom prst="rect">
+                      <a:avLst/>
+                    </a:prstGeom>
+                    <a:noFill/>
+                    <a:ln>
+                      <a:noFill/>
+                    </a:ln>
+                  </pic:spPr>
+                </pic:pic>
+              </a:graphicData>
+            </a:graphic>
+          </wp:inline>
+        </w:drawing>
+      </w:r>
+    </w:p>
+    <w:p>
+      <w:pPr>
+        <w:pStyle w:val="ListParagraph"/>
+        <w:numPr>
+          <w:ilvl w:val="0"/>
+          <w:numId w:val="12"/>
+        </w:numPr>
+        <w:rPr>
+          <w:lang w:val="en-IN"/>
+        </w:rPr>
+      </w:pPr>
+      <w:r>
+        <w:rPr>
+          <w:lang w:val="en-IN"/>
+        </w:rPr>
+        <w:t>Deleting a Goal</w:t>
+      </w:r>
+      <w:r>
+        <w:rPr>
+          <w:lang w:val="en-IN"/>
+        </w:rPr>
+        <w:t>:</w:t>
+      </w:r>
+    </w:p>
+    <w:p>
+      <w:pPr>
+        <w:pStyle w:val="ListParagraph"/>
+        <w:numPr>
+          <w:ilvl w:val="1"/>
+          <w:numId w:val="12"/>
+        </w:numPr>
+        <w:rPr>
+          <w:lang w:val="en-IN"/>
+        </w:rPr>
+      </w:pPr>
+      <w:r>
+        <w:rPr>
+          <w:lang w:val="en-IN"/>
+        </w:rPr>
+        <w:t>The user can select a goal from any state (Active, Expired or Completed) to delete.</w:t>
+      </w:r>
+    </w:p>
+    <w:p>
+      <w:pPr>
+        <w:pStyle w:val="ListParagraph"/>
+        <w:ind w:left="1440"/>
+        <w:rPr>
+          <w:lang w:val="en-IN"/>
+        </w:rPr>
+      </w:pPr>
+      <w:r>
+        <w:rPr>
+          <w:noProof/>
+        </w:rPr>
+        <w:drawing>
+          <wp:inline distT="0" distB="0" distL="0" distR="0" wp14:anchorId="2ACB8B4D" wp14:editId="3A18EE87">
+            <wp:extent cx="5057378" cy="3865034"/>
+            <wp:effectExtent l="0" t="0" r="0" b="2540"/>
+            <wp:docPr id="2093860394" name="Picture 21" descr="A screenshot of a computer&#10;&#10;AI-generated content may be incorrect."/>
+            <wp:cNvGraphicFramePr>
+              <a:graphicFrameLocks xmlns:a="http://schemas.openxmlformats.org/drawingml/2006/main" noChangeAspect="1"/>
+            </wp:cNvGraphicFramePr>
+            <a:graphic xmlns:a="http://schemas.openxmlformats.org/drawingml/2006/main">
+              <a:graphicData uri="http://schemas.openxmlformats.org/drawingml/2006/picture">
+                <pic:pic xmlns:pic="http://schemas.openxmlformats.org/drawingml/2006/picture">
+                  <pic:nvPicPr>
+                    <pic:cNvPr id="2093860394" name="Picture 21" descr="A screenshot of a computer&#10;&#10;AI-generated content may be incorrect."/>
+                    <pic:cNvPicPr>
+                      <a:picLocks noChangeAspect="1" noChangeArrowheads="1"/>
+                    </pic:cNvPicPr>
+                  </pic:nvPicPr>
+                  <pic:blipFill>
+                    <a:blip r:embed="rId41" cstate="print">
+                      <a:extLst>
+                        <a:ext uri="{28A0092B-C50C-407E-A947-70E740481C1C}">
+                          <a14:useLocalDpi xmlns:a14="http://schemas.microsoft.com/office/drawing/2010/main" val="0"/>
+                        </a:ext>
+                      </a:extLst>
+                    </a:blip>
+                    <a:srcRect/>
+                    <a:stretch>
+                      <a:fillRect/>
+                    </a:stretch>
+                  </pic:blipFill>
+                  <pic:spPr bwMode="auto">
+                    <a:xfrm>
+                      <a:off x="0" y="0"/>
+                      <a:ext cx="5075207" cy="3878659"/>
+                    </a:xfrm>
+                    <a:prstGeom prst="rect">
+                      <a:avLst/>
+                    </a:prstGeom>
+                    <a:noFill/>
+                    <a:ln>
+                      <a:noFill/>
+                    </a:ln>
+                  </pic:spPr>
+                </pic:pic>
+              </a:graphicData>
+            </a:graphic>
+          </wp:inline>
+        </w:drawing>
+      </w:r>
+    </w:p>
+    <w:p>
+      <w:pPr>
+        <w:pStyle w:val="ListParagraph"/>
+        <w:numPr>
+          <w:ilvl w:val="1"/>
+          <w:numId w:val="12"/>
+        </w:numPr>
+        <w:rPr>
+          <w:lang w:val="en-IN"/>
+        </w:rPr>
+      </w:pPr>
+      <w:r>
+        <w:rPr>
+          <w:lang w:val="en-IN"/>
+        </w:rPr>
+        <w:t>The user can click the delete button next to the goal they have chosen to delete at which point the goal will be removed from the tracker.</w:t>
+      </w:r>
+    </w:p>
+    <w:p>
+      <w:pPr>
+        <w:pStyle w:val="ListParagraph"/>
+        <w:ind w:left="1440"/>
+        <w:rPr>
+          <w:lang w:val="en-IN"/>
+        </w:rPr>
+      </w:pPr>
+      <w:r>
+        <w:rPr>
+          <w:noProof/>
+        </w:rPr>
+        <w:lastRenderedPageBreak/>
+        <w:drawing>
+          <wp:inline distT="0" distB="0" distL="0" distR="0" wp14:anchorId="017C93E5" wp14:editId="5C26084A">
+            <wp:extent cx="5128471" cy="3297767"/>
+            <wp:effectExtent l="0" t="0" r="0" b="0"/>
+            <wp:docPr id="211952018" name="Picture 22" descr="A screenshot of a computer&#10;&#10;AI-generated content may be incorrect."/>
+            <wp:cNvGraphicFramePr>
+              <a:graphicFrameLocks xmlns:a="http://schemas.openxmlformats.org/drawingml/2006/main" noChangeAspect="1"/>
+            </wp:cNvGraphicFramePr>
+            <a:graphic xmlns:a="http://schemas.openxmlformats.org/drawingml/2006/main">
+              <a:graphicData uri="http://schemas.openxmlformats.org/drawingml/2006/picture">
+                <pic:pic xmlns:pic="http://schemas.openxmlformats.org/drawingml/2006/picture">
+                  <pic:nvPicPr>
+                    <pic:cNvPr id="211952018" name="Picture 22" descr="A screenshot of a computer&#10;&#10;AI-generated content may be incorrect."/>
+                    <pic:cNvPicPr>
+                      <a:picLocks noChangeAspect="1" noChangeArrowheads="1"/>
+                    </pic:cNvPicPr>
+                  </pic:nvPicPr>
+                  <pic:blipFill>
+                    <a:blip r:embed="rId42" cstate="print">
+                      <a:extLst>
+                        <a:ext uri="{28A0092B-C50C-407E-A947-70E740481C1C}">
+                          <a14:useLocalDpi xmlns:a14="http://schemas.microsoft.com/office/drawing/2010/main" val="0"/>
+                        </a:ext>
+                      </a:extLst>
+                    </a:blip>
+                    <a:srcRect/>
+                    <a:stretch>
+                      <a:fillRect/>
+                    </a:stretch>
+                  </pic:blipFill>
+                  <pic:spPr bwMode="auto">
+                    <a:xfrm>
+                      <a:off x="0" y="0"/>
+                      <a:ext cx="5142594" cy="3306849"/>
+                    </a:xfrm>
+                    <a:prstGeom prst="rect">
+                      <a:avLst/>
+                    </a:prstGeom>
+                    <a:noFill/>
+                    <a:ln>
+                      <a:noFill/>
+                    </a:ln>
+                  </pic:spPr>
+                </pic:pic>
+              </a:graphicData>
+            </a:graphic>
+          </wp:inline>
+        </w:drawing>
+      </w:r>
+    </w:p>
+    <w:p>
+      <w:pPr>
+        <w:pStyle w:val="ListParagraph"/>
+        <w:numPr>
+          <w:ilvl w:val="0"/>
+          <w:numId w:val="12"/>
+        </w:numPr>
+        <w:rPr>
+          <w:lang w:val="en-IN"/>
+        </w:rPr>
+      </w:pPr>
+      <w:r>
+        <w:rPr>
+          <w:lang w:val="en-IN"/>
+        </w:rPr>
+        <w:t>Goal Expiration:</w:t>
+      </w:r>
+    </w:p>
+    <w:p>
+      <w:pPr>
+        <w:pStyle w:val="ListParagraph"/>
+        <w:numPr>
+          <w:ilvl w:val="1"/>
+          <w:numId w:val="12"/>
+        </w:numPr>
+        <w:rPr>
+          <w:lang w:val="en-IN"/>
+        </w:rPr>
+      </w:pPr>
+      <w:r>
+        <w:rPr>
+          <w:lang w:val="en-IN"/>
+        </w:rPr>
+        <w:t>If the user hasn’t completed an Active goal during the goal duration that they have set for it, then the goal will be moved from the Active Goals list to the Expired Goals list.</w:t>
+      </w:r>
+    </w:p>
+    <w:p>
+      <w:pPr>
+        <w:pStyle w:val="ListParagraph"/>
+        <w:numPr>
+          <w:ilvl w:val="2"/>
+          <w:numId w:val="12"/>
+        </w:numPr>
+        <w:rPr>
+          <w:lang w:val="en-IN"/>
+        </w:rPr>
+      </w:pPr>
+      <w:r>
+        <w:rPr>
+          <w:lang w:val="en-IN"/>
+        </w:rPr>
+        <w:t>The goal in its active state</w:t>
+      </w:r>
+      <w:r>
+        <w:rPr>
+          <w:lang w:val="en-IN"/>
+        </w:rPr>
+        <w:t>:</w:t>
+      </w:r>
+    </w:p>
+    <w:p>
+      <w:pPr>
+        <w:pStyle w:val="ListParagraph"/>
+        <w:ind w:left="2160"/>
+        <w:rPr>
+          <w:lang w:val="en-IN"/>
+        </w:rPr>
+      </w:pPr>
+      <w:r>
+        <w:rPr>
+          <w:noProof/>
+        </w:rPr>
+        <w:drawing>
+          <wp:inline distT="0" distB="0" distL="0" distR="0" wp14:anchorId="6FB5808A" wp14:editId="17CE3077">
+            <wp:extent cx="4914477" cy="3246735"/>
+            <wp:effectExtent l="0" t="0" r="635" b="0"/>
+            <wp:docPr id="1427937144" name="Picture 23" descr="A screenshot of a computer&#10;&#10;AI-generated content may be incorrect."/>
+            <wp:cNvGraphicFramePr>
+              <a:graphicFrameLocks xmlns:a="http://schemas.openxmlformats.org/drawingml/2006/main" noChangeAspect="1"/>
+            </wp:cNvGraphicFramePr>
+            <a:graphic xmlns:a="http://schemas.openxmlformats.org/drawingml/2006/main">
+              <a:graphicData uri="http://schemas.openxmlformats.org/drawingml/2006/picture">
+                <pic:pic xmlns:pic="http://schemas.openxmlformats.org/drawingml/2006/picture">
+                  <pic:nvPicPr>
+                    <pic:cNvPr id="1427937144" name="Picture 23" descr="A screenshot of a computer&#10;&#10;AI-generated content may be incorrect."/>
+                    <pic:cNvPicPr>
+                      <a:picLocks noChangeAspect="1" noChangeArrowheads="1"/>
+                    </pic:cNvPicPr>
+                  </pic:nvPicPr>
+                  <pic:blipFill>
+                    <a:blip r:embed="rId43" cstate="print">
+                      <a:extLst>
+                        <a:ext uri="{28A0092B-C50C-407E-A947-70E740481C1C}">
+                          <a14:useLocalDpi xmlns:a14="http://schemas.microsoft.com/office/drawing/2010/main" val="0"/>
+                        </a:ext>
+                      </a:extLst>
+                    </a:blip>
+                    <a:srcRect/>
+                    <a:stretch>
+                      <a:fillRect/>
+                    </a:stretch>
+                  </pic:blipFill>
+                  <pic:spPr bwMode="auto">
+                    <a:xfrm>
+                      <a:off x="0" y="0"/>
+                      <a:ext cx="4927103" cy="3255077"/>
+                    </a:xfrm>
+                    <a:prstGeom prst="rect">
+                      <a:avLst/>
+                    </a:prstGeom>
+                    <a:noFill/>
+                    <a:ln>
+                      <a:noFill/>
+                    </a:ln>
+                  </pic:spPr>
+                </pic:pic>
+              </a:graphicData>
+            </a:graphic>
+          </wp:inline>
+        </w:drawing>
+      </w:r>
+      <w:r>
+        <w:rPr>
+          <w:lang w:val="en-IN"/>
+        </w:rPr>
+        <w:t xml:space="preserve"> </w:t>
+      </w:r>
+    </w:p>
+    <w:p>
+      <w:pPr>
+        <w:pStyle w:val="ListParagraph"/>
+        <w:numPr>
+          <w:ilvl w:val="2"/>
+          <w:numId w:val="12"/>
+        </w:numPr>
+        <w:rPr>
+          <w:lang w:val="en-IN"/>
+        </w:rPr>
+      </w:pPr>
+      <w:r>
+        <w:rPr>
+          <w:lang w:val="en-IN"/>
+        </w:rPr>
+        <w:t xml:space="preserve">The goal after it has expired </w:t>
+      </w:r>
+      <w:r>
+        <w:rPr>
+          <w:lang w:val="en-IN"/>
+        </w:rPr>
+        <w:t xml:space="preserve">in the Expired Goals list </w:t>
+      </w:r>
+      <w:r>
+        <w:rPr>
+          <w:lang w:val="en-IN"/>
+        </w:rPr>
+        <w:t>with date and time of its expiration listed</w:t>
+      </w:r>
+      <w:r>
+        <w:rPr>
+          <w:lang w:val="en-IN"/>
+        </w:rPr>
+        <w:t>:</w:t>
+      </w:r>
+    </w:p>
+    <w:p>
+      <w:pPr>
+        <w:pStyle w:val="ListParagraph"/>
+        <w:ind w:left="2160"/>
+        <w:rPr>
+          <w:lang w:val="en-IN"/>
+        </w:rPr>
+      </w:pPr>
+      <w:r>
+        <w:rPr>
+          <w:noProof/>
+        </w:rPr>
+        <w:lastRenderedPageBreak/>
+        <w:drawing>
+          <wp:anchor distT="0" distB="0" distL="114300" distR="114300" simplePos="0" relativeHeight="251660288" behindDoc="0" locked="0" layoutInCell="1" allowOverlap="1" wp14:anchorId="0BE67561" wp14:editId="067D8118">
+            <wp:simplePos x="0" y="0"/>
+            <wp:positionH relativeFrom="margin">
+              <wp:align>center</wp:align>
+            </wp:positionH>
+            <wp:positionV relativeFrom="paragraph">
+              <wp:posOffset>0</wp:posOffset>
+            </wp:positionV>
+            <wp:extent cx="6264424" cy="3453553"/>
+            <wp:effectExtent l="0" t="0" r="3175" b="0"/>
+            <wp:wrapSquare wrapText="bothSides"/>
+            <wp:docPr id="684218120" name="Picture 24" descr="A screenshot of a computer&#10;&#10;AI-generated content may be incorrect."/>
+            <wp:cNvGraphicFramePr>
+              <a:graphicFrameLocks xmlns:a="http://schemas.openxmlformats.org/drawingml/2006/main" noChangeAspect="1"/>
+            </wp:cNvGraphicFramePr>
+            <a:graphic xmlns:a="http://schemas.openxmlformats.org/drawingml/2006/main">
+              <a:graphicData uri="http://schemas.openxmlformats.org/drawingml/2006/picture">
+                <pic:pic xmlns:pic="http://schemas.openxmlformats.org/drawingml/2006/picture">
+                  <pic:nvPicPr>
+                    <pic:cNvPr id="684218120" name="Picture 24" descr="A screenshot of a computer&#10;&#10;AI-generated content may be incorrect."/>
+                    <pic:cNvPicPr>
+                      <a:picLocks noChangeAspect="1" noChangeArrowheads="1"/>
+                    </pic:cNvPicPr>
+                  </pic:nvPicPr>
+                  <pic:blipFill>
+                    <a:blip r:embed="rId44" cstate="print">
+                      <a:extLst>
+                        <a:ext uri="{28A0092B-C50C-407E-A947-70E740481C1C}">
+                          <a14:useLocalDpi xmlns:a14="http://schemas.microsoft.com/office/drawing/2010/main" val="0"/>
+                        </a:ext>
+                      </a:extLst>
+                    </a:blip>
+                    <a:srcRect/>
+                    <a:stretch>
+                      <a:fillRect/>
+                    </a:stretch>
+                  </pic:blipFill>
+                  <pic:spPr bwMode="auto">
+                    <a:xfrm>
+                      <a:off x="0" y="0"/>
+                      <a:ext cx="6264424" cy="3453553"/>
+                    </a:xfrm>
+                    <a:prstGeom prst="rect">
+                      <a:avLst/>
+                    </a:prstGeom>
+                    <a:noFill/>
+                    <a:ln>
+                      <a:noFill/>
+                    </a:ln>
+                  </pic:spPr>
+                </pic:pic>
+              </a:graphicData>
+            </a:graphic>
+            <wp14:sizeRelH relativeFrom="margin">
+              <wp14:pctWidth>0</wp14:pctWidth>
+            </wp14:sizeRelH>
+            <wp14:sizeRelV relativeFrom="margin">
+              <wp14:pctHeight>0</wp14:pctHeight>
+            </wp14:sizeRelV>
+          </wp:anchor>
+        </w:drawing>
+      </w:r>
+    </w:p>
+    <w:p>
+      <w:r>
+        <w:rPr>
+          <w:b/>
+          <w:bCs/>
+          <w:lang w:val="en-IN"/>
+        </w:rPr>
         <w:t>End of User Manual</w:t>
       </w:r>
     </w:p>
     <w:p/>
     <w:sectPr>
-      <w:footerReference w:type="default" r:id="rId35"/>
+      <w:footerReference w:type="default" r:id="rId45"/>
       <w:pgSz w:w="11906" w:h="16838"/>
       <w:pgMar w:top="1440" w:right="1440" w:bottom="1440" w:left="1440" w:header="0" w:footer="708" w:gutter="0"/>
       <w:pgNumType w:start="0"/>
@@ -5532,6 +7049,95 @@
     </w:lvl>
   </w:abstractNum>
   <w:abstractNum w:abstractNumId="3" w15:restartNumberingAfterBreak="0">
+    <w:nsid w:val="0FEF7910"/>
+    <w:multiLevelType w:val="hybridMultilevel"/>
+    <w:tmpl w:val="6D641D84"/>
+    <w:lvl w:ilvl="0" w:tplc="AD228E02">
+      <w:start w:val="1"/>
+      <w:numFmt w:val="decimal"/>
+      <w:lvlText w:val="%1-"/>
+      <w:lvlJc w:val="left"/>
+      <w:pPr>
+        <w:ind w:left="1080" w:hanging="360"/>
+      </w:pPr>
+      <w:rPr>
+        <w:rFonts w:hint="default"/>
+      </w:rPr>
+    </w:lvl>
+    <w:lvl w:ilvl="1" w:tplc="08090019" w:tentative="1">
+      <w:start w:val="1"/>
+      <w:numFmt w:val="lowerLetter"/>
+      <w:lvlText w:val="%2."/>
+      <w:lvlJc w:val="left"/>
+      <w:pPr>
+        <w:ind w:left="1800" w:hanging="360"/>
+      </w:pPr>
+    </w:lvl>
+    <w:lvl w:ilvl="2" w:tplc="0809001B" w:tentative="1">
+      <w:start w:val="1"/>
+      <w:numFmt w:val="lowerRoman"/>
+      <w:lvlText w:val="%3."/>
+      <w:lvlJc w:val="right"/>
+      <w:pPr>
+        <w:ind w:left="2520" w:hanging="180"/>
+      </w:pPr>
+    </w:lvl>
+    <w:lvl w:ilvl="3" w:tplc="0809000F" w:tentative="1">
+      <w:start w:val="1"/>
+      <w:numFmt w:val="decimal"/>
+      <w:lvlText w:val="%4."/>
+      <w:lvlJc w:val="left"/>
+      <w:pPr>
+        <w:ind w:left="3240" w:hanging="360"/>
+      </w:pPr>
+    </w:lvl>
+    <w:lvl w:ilvl="4" w:tplc="08090019" w:tentative="1">
+      <w:start w:val="1"/>
+      <w:numFmt w:val="lowerLetter"/>
+      <w:lvlText w:val="%5."/>
+      <w:lvlJc w:val="left"/>
+      <w:pPr>
+        <w:ind w:left="3960" w:hanging="360"/>
+      </w:pPr>
+    </w:lvl>
+    <w:lvl w:ilvl="5" w:tplc="0809001B" w:tentative="1">
+      <w:start w:val="1"/>
+      <w:numFmt w:val="lowerRoman"/>
+      <w:lvlText w:val="%6."/>
+      <w:lvlJc w:val="right"/>
+      <w:pPr>
+        <w:ind w:left="4680" w:hanging="180"/>
+      </w:pPr>
+    </w:lvl>
+    <w:lvl w:ilvl="6" w:tplc="0809000F" w:tentative="1">
+      <w:start w:val="1"/>
+      <w:numFmt w:val="decimal"/>
+      <w:lvlText w:val="%7."/>
+      <w:lvlJc w:val="left"/>
+      <w:pPr>
+        <w:ind w:left="5400" w:hanging="360"/>
+      </w:pPr>
+    </w:lvl>
+    <w:lvl w:ilvl="7" w:tplc="08090019" w:tentative="1">
+      <w:start w:val="1"/>
+      <w:numFmt w:val="lowerLetter"/>
+      <w:lvlText w:val="%8."/>
+      <w:lvlJc w:val="left"/>
+      <w:pPr>
+        <w:ind w:left="6120" w:hanging="360"/>
+      </w:pPr>
+    </w:lvl>
+    <w:lvl w:ilvl="8" w:tplc="0809001B" w:tentative="1">
+      <w:start w:val="1"/>
+      <w:numFmt w:val="lowerRoman"/>
+      <w:lvlText w:val="%9."/>
+      <w:lvlJc w:val="right"/>
+      <w:pPr>
+        <w:ind w:left="6840" w:hanging="180"/>
+      </w:pPr>
+    </w:lvl>
+  </w:abstractNum>
+  <w:abstractNum w:abstractNumId="4" w15:restartNumberingAfterBreak="0">
     <w:nsid w:val="2DE42FEA"/>
     <w:multiLevelType w:val="multilevel"/>
     <w:tmpl w:val="C43A9F20"/>
@@ -5644,7 +7250,185 @@
       </w:pPr>
     </w:lvl>
   </w:abstractNum>
-  <w:abstractNum w:abstractNumId="4" w15:restartNumberingAfterBreak="0">
+  <w:abstractNum w:abstractNumId="5" w15:restartNumberingAfterBreak="0">
+    <w:nsid w:val="34BC529E"/>
+    <w:multiLevelType w:val="hybridMultilevel"/>
+    <w:tmpl w:val="2466ADA4"/>
+    <w:lvl w:ilvl="0" w:tplc="08090011">
+      <w:start w:val="1"/>
+      <w:numFmt w:val="decimal"/>
+      <w:lvlText w:val="%1)"/>
+      <w:lvlJc w:val="left"/>
+      <w:pPr>
+        <w:ind w:left="720" w:hanging="360"/>
+      </w:pPr>
+      <w:rPr>
+        <w:rFonts w:hint="default"/>
+      </w:rPr>
+    </w:lvl>
+    <w:lvl w:ilvl="1" w:tplc="08090019">
+      <w:start w:val="1"/>
+      <w:numFmt w:val="lowerLetter"/>
+      <w:lvlText w:val="%2."/>
+      <w:lvlJc w:val="left"/>
+      <w:pPr>
+        <w:ind w:left="1440" w:hanging="360"/>
+      </w:pPr>
+    </w:lvl>
+    <w:lvl w:ilvl="2" w:tplc="0809001B">
+      <w:start w:val="1"/>
+      <w:numFmt w:val="lowerRoman"/>
+      <w:lvlText w:val="%3."/>
+      <w:lvlJc w:val="right"/>
+      <w:pPr>
+        <w:ind w:left="2160" w:hanging="180"/>
+      </w:pPr>
+    </w:lvl>
+    <w:lvl w:ilvl="3" w:tplc="0809000F" w:tentative="1">
+      <w:start w:val="1"/>
+      <w:numFmt w:val="decimal"/>
+      <w:lvlText w:val="%4."/>
+      <w:lvlJc w:val="left"/>
+      <w:pPr>
+        <w:ind w:left="2880" w:hanging="360"/>
+      </w:pPr>
+    </w:lvl>
+    <w:lvl w:ilvl="4" w:tplc="08090019" w:tentative="1">
+      <w:start w:val="1"/>
+      <w:numFmt w:val="lowerLetter"/>
+      <w:lvlText w:val="%5."/>
+      <w:lvlJc w:val="left"/>
+      <w:pPr>
+        <w:ind w:left="3600" w:hanging="360"/>
+      </w:pPr>
+    </w:lvl>
+    <w:lvl w:ilvl="5" w:tplc="0809001B" w:tentative="1">
+      <w:start w:val="1"/>
+      <w:numFmt w:val="lowerRoman"/>
+      <w:lvlText w:val="%6."/>
+      <w:lvlJc w:val="right"/>
+      <w:pPr>
+        <w:ind w:left="4320" w:hanging="180"/>
+      </w:pPr>
+    </w:lvl>
+    <w:lvl w:ilvl="6" w:tplc="0809000F" w:tentative="1">
+      <w:start w:val="1"/>
+      <w:numFmt w:val="decimal"/>
+      <w:lvlText w:val="%7."/>
+      <w:lvlJc w:val="left"/>
+      <w:pPr>
+        <w:ind w:left="5040" w:hanging="360"/>
+      </w:pPr>
+    </w:lvl>
+    <w:lvl w:ilvl="7" w:tplc="08090019" w:tentative="1">
+      <w:start w:val="1"/>
+      <w:numFmt w:val="lowerLetter"/>
+      <w:lvlText w:val="%8."/>
+      <w:lvlJc w:val="left"/>
+      <w:pPr>
+        <w:ind w:left="5760" w:hanging="360"/>
+      </w:pPr>
+    </w:lvl>
+    <w:lvl w:ilvl="8" w:tplc="0809001B" w:tentative="1">
+      <w:start w:val="1"/>
+      <w:numFmt w:val="lowerRoman"/>
+      <w:lvlText w:val="%9."/>
+      <w:lvlJc w:val="right"/>
+      <w:pPr>
+        <w:ind w:left="6480" w:hanging="180"/>
+      </w:pPr>
+    </w:lvl>
+  </w:abstractNum>
+  <w:abstractNum w:abstractNumId="6" w15:restartNumberingAfterBreak="0">
+    <w:nsid w:val="3BFF6A50"/>
+    <w:multiLevelType w:val="hybridMultilevel"/>
+    <w:tmpl w:val="9EEEA874"/>
+    <w:lvl w:ilvl="0" w:tplc="89D8B37E">
+      <w:start w:val="1"/>
+      <w:numFmt w:val="decimal"/>
+      <w:lvlText w:val="%1)"/>
+      <w:lvlJc w:val="left"/>
+      <w:pPr>
+        <w:ind w:left="1440" w:hanging="360"/>
+      </w:pPr>
+      <w:rPr>
+        <w:rFonts w:hint="default"/>
+      </w:rPr>
+    </w:lvl>
+    <w:lvl w:ilvl="1" w:tplc="08090019" w:tentative="1">
+      <w:start w:val="1"/>
+      <w:numFmt w:val="lowerLetter"/>
+      <w:lvlText w:val="%2."/>
+      <w:lvlJc w:val="left"/>
+      <w:pPr>
+        <w:ind w:left="2160" w:hanging="360"/>
+      </w:pPr>
+    </w:lvl>
+    <w:lvl w:ilvl="2" w:tplc="0809001B" w:tentative="1">
+      <w:start w:val="1"/>
+      <w:numFmt w:val="lowerRoman"/>
+      <w:lvlText w:val="%3."/>
+      <w:lvlJc w:val="right"/>
+      <w:pPr>
+        <w:ind w:left="2880" w:hanging="180"/>
+      </w:pPr>
+    </w:lvl>
+    <w:lvl w:ilvl="3" w:tplc="0809000F" w:tentative="1">
+      <w:start w:val="1"/>
+      <w:numFmt w:val="decimal"/>
+      <w:lvlText w:val="%4."/>
+      <w:lvlJc w:val="left"/>
+      <w:pPr>
+        <w:ind w:left="3600" w:hanging="360"/>
+      </w:pPr>
+    </w:lvl>
+    <w:lvl w:ilvl="4" w:tplc="08090019" w:tentative="1">
+      <w:start w:val="1"/>
+      <w:numFmt w:val="lowerLetter"/>
+      <w:lvlText w:val="%5."/>
+      <w:lvlJc w:val="left"/>
+      <w:pPr>
+        <w:ind w:left="4320" w:hanging="360"/>
+      </w:pPr>
+    </w:lvl>
+    <w:lvl w:ilvl="5" w:tplc="0809001B" w:tentative="1">
+      <w:start w:val="1"/>
+      <w:numFmt w:val="lowerRoman"/>
+      <w:lvlText w:val="%6."/>
+      <w:lvlJc w:val="right"/>
+      <w:pPr>
+        <w:ind w:left="5040" w:hanging="180"/>
+      </w:pPr>
+    </w:lvl>
+    <w:lvl w:ilvl="6" w:tplc="0809000F" w:tentative="1">
+      <w:start w:val="1"/>
+      <w:numFmt w:val="decimal"/>
+      <w:lvlText w:val="%7."/>
+      <w:lvlJc w:val="left"/>
+      <w:pPr>
+        <w:ind w:left="5760" w:hanging="360"/>
+      </w:pPr>
+    </w:lvl>
+    <w:lvl w:ilvl="7" w:tplc="08090019" w:tentative="1">
+      <w:start w:val="1"/>
+      <w:numFmt w:val="lowerLetter"/>
+      <w:lvlText w:val="%8."/>
+      <w:lvlJc w:val="left"/>
+      <w:pPr>
+        <w:ind w:left="6480" w:hanging="360"/>
+      </w:pPr>
+    </w:lvl>
+    <w:lvl w:ilvl="8" w:tplc="0809001B" w:tentative="1">
+      <w:start w:val="1"/>
+      <w:numFmt w:val="lowerRoman"/>
+      <w:lvlText w:val="%9."/>
+      <w:lvlJc w:val="right"/>
+      <w:pPr>
+        <w:ind w:left="7200" w:hanging="180"/>
+      </w:pPr>
+    </w:lvl>
+  </w:abstractNum>
+  <w:abstractNum w:abstractNumId="7" w15:restartNumberingAfterBreak="0">
     <w:nsid w:val="4B665BA8"/>
     <w:multiLevelType w:val="multilevel"/>
     <w:tmpl w:val="E88E0DCE"/>
@@ -5757,7 +7541,93 @@
       </w:pPr>
     </w:lvl>
   </w:abstractNum>
-  <w:abstractNum w:abstractNumId="5" w15:restartNumberingAfterBreak="0">
+  <w:abstractNum w:abstractNumId="8" w15:restartNumberingAfterBreak="0">
+    <w:nsid w:val="52E44CC4"/>
+    <w:multiLevelType w:val="hybridMultilevel"/>
+    <w:tmpl w:val="6A084C0A"/>
+    <w:lvl w:ilvl="0" w:tplc="08090011">
+      <w:start w:val="1"/>
+      <w:numFmt w:val="decimal"/>
+      <w:lvlText w:val="%1)"/>
+      <w:lvlJc w:val="left"/>
+      <w:pPr>
+        <w:ind w:left="1080" w:hanging="360"/>
+      </w:pPr>
+    </w:lvl>
+    <w:lvl w:ilvl="1" w:tplc="08090019" w:tentative="1">
+      <w:start w:val="1"/>
+      <w:numFmt w:val="lowerLetter"/>
+      <w:lvlText w:val="%2."/>
+      <w:lvlJc w:val="left"/>
+      <w:pPr>
+        <w:ind w:left="1800" w:hanging="360"/>
+      </w:pPr>
+    </w:lvl>
+    <w:lvl w:ilvl="2" w:tplc="0809001B" w:tentative="1">
+      <w:start w:val="1"/>
+      <w:numFmt w:val="lowerRoman"/>
+      <w:lvlText w:val="%3."/>
+      <w:lvlJc w:val="right"/>
+      <w:pPr>
+        <w:ind w:left="2520" w:hanging="180"/>
+      </w:pPr>
+    </w:lvl>
+    <w:lvl w:ilvl="3" w:tplc="0809000F" w:tentative="1">
+      <w:start w:val="1"/>
+      <w:numFmt w:val="decimal"/>
+      <w:lvlText w:val="%4."/>
+      <w:lvlJc w:val="left"/>
+      <w:pPr>
+        <w:ind w:left="3240" w:hanging="360"/>
+      </w:pPr>
+    </w:lvl>
+    <w:lvl w:ilvl="4" w:tplc="08090019" w:tentative="1">
+      <w:start w:val="1"/>
+      <w:numFmt w:val="lowerLetter"/>
+      <w:lvlText w:val="%5."/>
+      <w:lvlJc w:val="left"/>
+      <w:pPr>
+        <w:ind w:left="3960" w:hanging="360"/>
+      </w:pPr>
+    </w:lvl>
+    <w:lvl w:ilvl="5" w:tplc="0809001B" w:tentative="1">
+      <w:start w:val="1"/>
+      <w:numFmt w:val="lowerRoman"/>
+      <w:lvlText w:val="%6."/>
+      <w:lvlJc w:val="right"/>
+      <w:pPr>
+        <w:ind w:left="4680" w:hanging="180"/>
+      </w:pPr>
+    </w:lvl>
+    <w:lvl w:ilvl="6" w:tplc="0809000F" w:tentative="1">
+      <w:start w:val="1"/>
+      <w:numFmt w:val="decimal"/>
+      <w:lvlText w:val="%7."/>
+      <w:lvlJc w:val="left"/>
+      <w:pPr>
+        <w:ind w:left="5400" w:hanging="360"/>
+      </w:pPr>
+    </w:lvl>
+    <w:lvl w:ilvl="7" w:tplc="08090019" w:tentative="1">
+      <w:start w:val="1"/>
+      <w:numFmt w:val="lowerLetter"/>
+      <w:lvlText w:val="%8."/>
+      <w:lvlJc w:val="left"/>
+      <w:pPr>
+        <w:ind w:left="6120" w:hanging="360"/>
+      </w:pPr>
+    </w:lvl>
+    <w:lvl w:ilvl="8" w:tplc="0809001B" w:tentative="1">
+      <w:start w:val="1"/>
+      <w:numFmt w:val="lowerRoman"/>
+      <w:lvlText w:val="%9."/>
+      <w:lvlJc w:val="right"/>
+      <w:pPr>
+        <w:ind w:left="6840" w:hanging="180"/>
+      </w:pPr>
+    </w:lvl>
+  </w:abstractNum>
+  <w:abstractNum w:abstractNumId="9" w15:restartNumberingAfterBreak="0">
     <w:nsid w:val="5D641FDB"/>
     <w:multiLevelType w:val="multilevel"/>
     <w:tmpl w:val="ADFE5C20"/>
@@ -5870,7 +7740,7 @@
       </w:pPr>
     </w:lvl>
   </w:abstractNum>
-  <w:abstractNum w:abstractNumId="6" w15:restartNumberingAfterBreak="0">
+  <w:abstractNum w:abstractNumId="10" w15:restartNumberingAfterBreak="0">
     <w:nsid w:val="6CF7079A"/>
     <w:multiLevelType w:val="multilevel"/>
     <w:tmpl w:val="BCDCEF50"/>
@@ -5983,7 +7853,7 @@
       </w:pPr>
     </w:lvl>
   </w:abstractNum>
-  <w:abstractNum w:abstractNumId="7" w15:restartNumberingAfterBreak="0">
+  <w:abstractNum w:abstractNumId="11" w15:restartNumberingAfterBreak="0">
     <w:nsid w:val="6F705988"/>
     <w:multiLevelType w:val="multilevel"/>
     <w:tmpl w:val="FD1E2F46"/>
@@ -6104,25 +7974,37 @@
     <w:abstractNumId w:val="0"/>
   </w:num>
   <w:num w:numId="2" w16cid:durableId="323435305">
-    <w:abstractNumId w:val="5"/>
+    <w:abstractNumId w:val="9"/>
   </w:num>
   <w:num w:numId="3" w16cid:durableId="985742551">
-    <w:abstractNumId w:val="4"/>
+    <w:abstractNumId w:val="7"/>
   </w:num>
   <w:num w:numId="4" w16cid:durableId="1609268602">
     <w:abstractNumId w:val="2"/>
   </w:num>
   <w:num w:numId="5" w16cid:durableId="388503207">
-    <w:abstractNumId w:val="7"/>
+    <w:abstractNumId w:val="11"/>
   </w:num>
   <w:num w:numId="6" w16cid:durableId="1719284911">
-    <w:abstractNumId w:val="6"/>
+    <w:abstractNumId w:val="10"/>
   </w:num>
   <w:num w:numId="7" w16cid:durableId="453136657">
-    <w:abstractNumId w:val="3"/>
+    <w:abstractNumId w:val="4"/>
   </w:num>
   <w:num w:numId="8" w16cid:durableId="365640841">
     <w:abstractNumId w:val="1"/>
+  </w:num>
+  <w:num w:numId="9" w16cid:durableId="1373652464">
+    <w:abstractNumId w:val="3"/>
+  </w:num>
+  <w:num w:numId="10" w16cid:durableId="1845437340">
+    <w:abstractNumId w:val="8"/>
+  </w:num>
+  <w:num w:numId="11" w16cid:durableId="1744182458">
+    <w:abstractNumId w:val="6"/>
+  </w:num>
+  <w:num w:numId="12" w16cid:durableId="2092702381">
+    <w:abstractNumId w:val="5"/>
   </w:num>
 </w:numbering>
 </file>
@@ -6527,7 +8409,7 @@
   <w:style w:type="paragraph" w:default="1" w:styleId="Normal">
     <w:name w:val="Normal"/>
     <w:qFormat/>
-    <w:rsid w:val="005C366A"/>
+    <w:rsid w:val="00D45432"/>
     <w:pPr>
       <w:spacing w:after="160" w:line="259" w:lineRule="auto"/>
     </w:pPr>

</xml_diff>